<commit_message>
step(2.8): add the reminder lifecycle test and flip FR-REM statuses
Learned: coverage audit against requirement IDs, deterministic job lifecycle testing, row-identity assertions, split-status honesty, as-built notes on stale design diagrams

Co-Authored-By: Claude Fable 5 <noreply@anthropic.com>
Claude-Session: https://claude.ai/code/session_01XCaaD2oSfQhWv3vNENZDue
</commit_message>
<xml_diff>
--- a/docs/deliverables/out/Architecture.docx
+++ b/docs/deliverables/out/Architecture.docx
@@ -7,7 +7,31 @@
         <w:pStyle w:val="Title"/>
       </w:pPr>
       <w:r>
-        <w:t xml:space="preserve">Wathiq — Software Architecture Document</w:t>
+        <w:t xml:space="preserve">Wathiq</w:t>
+      </w:r>
+      <w:r>
+        <w:t xml:space="preserve"> </w:t>
+      </w:r>
+      <w:r>
+        <w:t xml:space="preserve">—</w:t>
+      </w:r>
+      <w:r>
+        <w:t xml:space="preserve"> </w:t>
+      </w:r>
+      <w:r>
+        <w:t xml:space="preserve">Software</w:t>
+      </w:r>
+      <w:r>
+        <w:t xml:space="preserve"> </w:t>
+      </w:r>
+      <w:r>
+        <w:t xml:space="preserve">Architecture</w:t>
+      </w:r>
+      <w:r>
+        <w:t xml:space="preserve"> </w:t>
+      </w:r>
+      <w:r>
+        <w:t xml:space="preserve">Document</w:t>
       </w:r>
     </w:p>
     <w:p>
@@ -15,7 +39,31 @@
         <w:pStyle w:val="Subtitle"/>
       </w:pPr>
       <w:r>
-        <w:t xml:space="preserve">وثيق — وثيقة معمارية البرمجيات</w:t>
+        <w:t xml:space="preserve">وثيق</w:t>
+      </w:r>
+      <w:r>
+        <w:t xml:space="preserve"> </w:t>
+      </w:r>
+      <w:r>
+        <w:t xml:space="preserve">—</w:t>
+      </w:r>
+      <w:r>
+        <w:t xml:space="preserve"> </w:t>
+      </w:r>
+      <w:r>
+        <w:t xml:space="preserve">وثيقة</w:t>
+      </w:r>
+      <w:r>
+        <w:t xml:space="preserve"> </w:t>
+      </w:r>
+      <w:r>
+        <w:t xml:space="preserve">معمارية</w:t>
+      </w:r>
+      <w:r>
+        <w:t xml:space="preserve"> </w:t>
+      </w:r>
+      <w:r>
+        <w:t xml:space="preserve">البرمجيات</w:t>
       </w:r>
     </w:p>
     <w:p>
@@ -60,7 +108,7 @@
         </w:p>
       </w:sdtContent>
     </w:sdt>
-    <w:bookmarkStart w:id="9" w:name="document-control"/>
+    <w:bookmarkStart w:id="20" w:name="document-control"/>
     <w:p>
       <w:pPr>
         <w:pStyle w:val="Heading1"/>
@@ -73,8 +121,8 @@
       <w:tblPr>
         <w:tblStyle w:val="Table"/>
         <w:tblW w:type="pct" w:w="5000"/>
-        <w:tblLayout w:type="fixed"/>
         <w:tblLook w:firstRow="1" w:lastRow="0" w:firstColumn="0" w:lastColumn="0" w:noHBand="0" w:noVBand="0" w:val="0020"/>
+        <w:jc w:val="start"/>
       </w:tblPr>
       <w:tblGrid>
         <w:gridCol w:w="1980"/>
@@ -84,13 +132,14 @@
       </w:tblGrid>
       <w:tr>
         <w:trPr>
-          <w:tblHeader w:val="on"/>
+          <w:tblHeader w:val="true"/>
         </w:trPr>
         <w:tc>
           <w:tcPr/>
           <w:p>
             <w:pPr>
               <w:pStyle w:val="Compact"/>
+              <w:jc w:val="left"/>
             </w:pPr>
             <w:r>
               <w:t xml:space="preserve">Version</w:t>
@@ -102,6 +151,7 @@
           <w:p>
             <w:pPr>
               <w:pStyle w:val="Compact"/>
+              <w:jc w:val="left"/>
             </w:pPr>
             <w:r>
               <w:t xml:space="preserve">Date</w:t>
@@ -113,6 +163,7 @@
           <w:p>
             <w:pPr>
               <w:pStyle w:val="Compact"/>
+              <w:jc w:val="left"/>
             </w:pPr>
             <w:r>
               <w:t xml:space="preserve">Author</w:t>
@@ -124,6 +175,7 @@
           <w:p>
             <w:pPr>
               <w:pStyle w:val="Compact"/>
+              <w:jc w:val="left"/>
             </w:pPr>
             <w:r>
               <w:t xml:space="preserve">Change</w:t>
@@ -137,6 +189,7 @@
           <w:p>
             <w:pPr>
               <w:pStyle w:val="Compact"/>
+              <w:jc w:val="left"/>
             </w:pPr>
             <w:r>
               <w:t xml:space="preserve">0.1</w:t>
@@ -148,6 +201,7 @@
           <w:p>
             <w:pPr>
               <w:pStyle w:val="Compact"/>
+              <w:jc w:val="left"/>
             </w:pPr>
             <w:r>
               <w:t xml:space="preserve">2026-08-27</w:t>
@@ -159,6 +213,7 @@
           <w:p>
             <w:pPr>
               <w:pStyle w:val="Compact"/>
+              <w:jc w:val="left"/>
             </w:pPr>
             <w:r>
               <w:t xml:space="preserve">Abdulsalam</w:t>
@@ -170,6 +225,7 @@
           <w:p>
             <w:pPr>
               <w:pStyle w:val="Compact"/>
+              <w:jc w:val="left"/>
             </w:pPr>
             <w:r>
               <w:t xml:space="preserve">C4 context + container, module map, key flows, decisions D1–D9 (roadmap step 0.5)</w:t>
@@ -184,24 +240,24 @@
       </w:pPr>
       <w:r>
         <w:rPr>
+          <w:bCs/>
           <w:b/>
+        </w:rPr>
+        <w:t xml:space="preserve">Status:</w:t>
+      </w:r>
+      <w:r>
+        <w:t xml:space="preserve"> </w:t>
+      </w:r>
+      <w:r>
+        <w:t xml:space="preserve">Draft ·</w:t>
+      </w:r>
+      <w:r>
+        <w:t xml:space="preserve"> </w:t>
+      </w:r>
+      <w:r>
+        <w:rPr>
           <w:bCs/>
-        </w:rPr>
-        <w:t xml:space="preserve">Status:</w:t>
-      </w:r>
-      <w:r>
-        <w:t xml:space="preserve"> </w:t>
-      </w:r>
-      <w:r>
-        <w:t xml:space="preserve">Draft ·</w:t>
-      </w:r>
-      <w:r>
-        <w:t xml:space="preserve"> </w:t>
-      </w:r>
-      <w:r>
-        <w:rPr>
           <w:b/>
-          <w:bCs/>
         </w:rPr>
         <w:t xml:space="preserve">Related:</w:t>
       </w:r>
@@ -276,8 +332,8 @@
       </w:r>
       <w:r>
         <w:rPr>
+          <w:iCs/>
           <w:i/>
-          <w:iCs/>
         </w:rPr>
         <w:t xml:space="preserve">Planned</w:t>
       </w:r>
@@ -285,8 +341,8 @@
         <w:t xml:space="preserve">.</w:t>
       </w:r>
     </w:p>
-    <w:bookmarkEnd w:id="9"/>
-    <w:bookmarkStart w:id="10" w:name="introduction"/>
+    <w:bookmarkEnd w:id="20"/>
+    <w:bookmarkStart w:id="21" w:name="introduction"/>
     <w:p>
       <w:pPr>
         <w:pStyle w:val="Heading1"/>
@@ -322,22 +378,22 @@
       </w:r>
       <w:r>
         <w:rPr>
+          <w:bCs/>
           <w:b/>
+        </w:rPr>
+        <w:t xml:space="preserve">modular</w:t>
+      </w:r>
+      <w:r>
+        <w:rPr>
           <w:bCs/>
-        </w:rPr>
-        <w:t xml:space="preserve">modular</w:t>
-      </w:r>
-      <w:r>
-        <w:rPr>
           <w:b/>
+        </w:rPr>
+        <w:t xml:space="preserve"> </w:t>
+      </w:r>
+      <w:r>
+        <w:rPr>
           <w:bCs/>
-        </w:rPr>
-        <w:t xml:space="preserve"> </w:t>
-      </w:r>
-      <w:r>
-        <w:rPr>
           <w:b/>
-          <w:bCs/>
         </w:rPr>
         <w:t xml:space="preserve">monolith</w:t>
       </w:r>
@@ -363,59 +419,59 @@
       </w:r>
       <w:r>
         <w:rPr>
+          <w:bCs/>
           <w:b/>
+        </w:rPr>
+        <w:t xml:space="preserve">C1</w:t>
+      </w:r>
+      <w:r>
+        <w:t xml:space="preserve"> </w:t>
+      </w:r>
+      <w:r>
+        <w:t xml:space="preserve">(personal data never reaches a</w:t>
+      </w:r>
+      <w:r>
+        <w:t xml:space="preserve"> </w:t>
+      </w:r>
+      <w:r>
+        <w:t xml:space="preserve">cloud AI), cost ceiling</w:t>
+      </w:r>
+      <w:r>
+        <w:t xml:space="preserve"> </w:t>
+      </w:r>
+      <w:r>
+        <w:rPr>
           <w:bCs/>
-        </w:rPr>
-        <w:t xml:space="preserve">C1</w:t>
-      </w:r>
-      <w:r>
-        <w:t xml:space="preserve"> </w:t>
-      </w:r>
-      <w:r>
-        <w:t xml:space="preserve">(personal data never reaches a</w:t>
-      </w:r>
-      <w:r>
-        <w:t xml:space="preserve"> </w:t>
-      </w:r>
-      <w:r>
-        <w:t xml:space="preserve">cloud AI), cost ceiling</w:t>
-      </w:r>
-      <w:r>
-        <w:t xml:space="preserve"> </w:t>
-      </w:r>
-      <w:r>
-        <w:rPr>
           <w:b/>
+        </w:rPr>
+        <w:t xml:space="preserve">C2</w:t>
+      </w:r>
+      <w:r>
+        <w:t xml:space="preserve"> </w:t>
+      </w:r>
+      <w:r>
+        <w:t xml:space="preserve">(≤ USD 20/month), solo operation (</w:t>
+      </w:r>
+      <w:r>
+        <w:rPr>
           <w:bCs/>
-        </w:rPr>
-        <w:t xml:space="preserve">C2</w:t>
-      </w:r>
-      <w:r>
-        <w:t xml:space="preserve"> </w:t>
-      </w:r>
-      <w:r>
-        <w:t xml:space="preserve">(≤ USD 20/month), solo operation (</w:t>
-      </w:r>
-      <w:r>
-        <w:rPr>
           <w:b/>
+        </w:rPr>
+        <w:t xml:space="preserve">NFR-OPS-001</w:t>
+      </w:r>
+      <w:r>
+        <w:t xml:space="preserve">), and</w:t>
+      </w:r>
+      <w:r>
+        <w:t xml:space="preserve"> </w:t>
+      </w:r>
+      <w:r>
+        <w:t xml:space="preserve">bilingual RTL UI (</w:t>
+      </w:r>
+      <w:r>
+        <w:rPr>
           <w:bCs/>
-        </w:rPr>
-        <w:t xml:space="preserve">NFR-OPS-001</w:t>
-      </w:r>
-      <w:r>
-        <w:t xml:space="preserve">), and</w:t>
-      </w:r>
-      <w:r>
-        <w:t xml:space="preserve"> </w:t>
-      </w:r>
-      <w:r>
-        <w:t xml:space="preserve">bilingual RTL UI (</w:t>
-      </w:r>
-      <w:r>
-        <w:rPr>
           <w:b/>
-          <w:bCs/>
         </w:rPr>
         <w:t xml:space="preserve">NFR-I18N-001</w:t>
       </w:r>
@@ -423,8 +479,8 @@
         <w:t xml:space="preserve">).</w:t>
       </w:r>
     </w:p>
-    <w:bookmarkEnd w:id="10"/>
-    <w:bookmarkStart w:id="14" w:name="c4-level-1-system-context"/>
+    <w:bookmarkEnd w:id="21"/>
+    <w:bookmarkStart w:id="25" w:name="c4-level-1-system-context"/>
     <w:p>
       <w:pPr>
         <w:pStyle w:val="Heading1"/>
@@ -451,18 +507,18 @@
           <wp:inline>
             <wp:extent cx="5334000" cy="5898696"/>
             <wp:effectExtent b="0" l="0" r="0" t="0"/>
-            <wp:docPr descr="System context" title="" id="12" name="Picture"/>
+            <wp:docPr descr="System context" title="" id="23" name="Picture"/>
             <a:graphic>
               <a:graphicData uri="http://schemas.openxmlformats.org/drawingml/2006/picture">
                 <pic:pic>
                   <pic:nvPicPr>
-                    <pic:cNvPr descr="assets/c4-context.png" id="13" name="Picture"/>
+                    <pic:cNvPr descr="assets/c4-context.png" id="24" name="Picture"/>
                     <pic:cNvPicPr>
                       <a:picLocks noChangeArrowheads="1" noChangeAspect="1"/>
                     </pic:cNvPicPr>
                   </pic:nvPicPr>
                   <pic:blipFill>
-                    <a:blip r:embed="rId11"/>
+                    <a:blip r:embed="rId22"/>
                     <a:stretch>
                       <a:fillRect/>
                     </a:stretch>
@@ -620,8 +676,8 @@
       <w:tblPr>
         <w:tblStyle w:val="Table"/>
         <w:tblW w:type="pct" w:w="5000"/>
-        <w:tblLayout w:type="fixed"/>
         <w:tblLook w:firstRow="1" w:lastRow="0" w:firstColumn="0" w:lastColumn="0" w:noHBand="0" w:noVBand="0" w:val="0020"/>
+        <w:jc w:val="start"/>
       </w:tblPr>
       <w:tblGrid>
         <w:gridCol w:w="2640"/>
@@ -630,13 +686,14 @@
       </w:tblGrid>
       <w:tr>
         <w:trPr>
-          <w:tblHeader w:val="on"/>
+          <w:tblHeader w:val="true"/>
         </w:trPr>
         <w:tc>
           <w:tcPr/>
           <w:p>
             <w:pPr>
               <w:pStyle w:val="Compact"/>
+              <w:jc w:val="left"/>
             </w:pPr>
             <w:r>
               <w:t xml:space="preserve">Element</w:t>
@@ -648,6 +705,7 @@
           <w:p>
             <w:pPr>
               <w:pStyle w:val="Compact"/>
+              <w:jc w:val="left"/>
             </w:pPr>
             <w:r>
               <w:t xml:space="preserve">Responsibility</w:t>
@@ -659,6 +717,7 @@
           <w:p>
             <w:pPr>
               <w:pStyle w:val="Compact"/>
+              <w:jc w:val="left"/>
             </w:pPr>
             <w:r>
               <w:t xml:space="preserve">Trust boundary</w:t>
@@ -672,6 +731,7 @@
           <w:p>
             <w:pPr>
               <w:pStyle w:val="Compact"/>
+              <w:jc w:val="left"/>
             </w:pPr>
             <w:r>
               <w:t xml:space="preserve">Resident / Family manager</w:t>
@@ -683,6 +743,7 @@
           <w:p>
             <w:pPr>
               <w:pStyle w:val="Compact"/>
+              <w:jc w:val="left"/>
             </w:pPr>
             <w:r>
               <w:t xml:space="preserve">Owns personal data; confirms every AI extraction</w:t>
@@ -694,6 +755,7 @@
           <w:p>
             <w:pPr>
               <w:pStyle w:val="Compact"/>
+              <w:jc w:val="left"/>
             </w:pPr>
             <w:r>
               <w:t xml:space="preserve">External person</w:t>
@@ -707,6 +769,7 @@
           <w:p>
             <w:pPr>
               <w:pStyle w:val="Compact"/>
+              <w:jc w:val="left"/>
             </w:pPr>
             <w:r>
               <w:t xml:space="preserve">Admin</w:t>
@@ -718,6 +781,7 @@
           <w:p>
             <w:pPr>
               <w:pStyle w:val="Compact"/>
+              <w:jc w:val="left"/>
             </w:pPr>
             <w:r>
               <w:t xml:space="preserve">Single operator</w:t>
@@ -729,6 +793,7 @@
           <w:p>
             <w:pPr>
               <w:pStyle w:val="Compact"/>
+              <w:jc w:val="left"/>
             </w:pPr>
             <w:r>
               <w:t xml:space="preserve">External person, elevated role</w:t>
@@ -742,6 +807,7 @@
           <w:p>
             <w:pPr>
               <w:pStyle w:val="Compact"/>
+              <w:jc w:val="left"/>
             </w:pPr>
             <w:r>
               <w:t xml:space="preserve">Wathiq</w:t>
@@ -753,6 +819,7 @@
           <w:p>
             <w:pPr>
               <w:pStyle w:val="Compact"/>
+              <w:jc w:val="left"/>
             </w:pPr>
             <w:r>
               <w:t xml:space="preserve">Everything that touches personal data</w:t>
@@ -764,6 +831,7 @@
           <w:p>
             <w:pPr>
               <w:pStyle w:val="Compact"/>
+              <w:jc w:val="left"/>
             </w:pPr>
             <w:r>
               <w:t xml:space="preserve">Our server</w:t>
@@ -777,6 +845,7 @@
           <w:p>
             <w:pPr>
               <w:pStyle w:val="Compact"/>
+              <w:jc w:val="left"/>
             </w:pPr>
             <w:r>
               <w:t xml:space="preserve">FCM, SMTP</w:t>
@@ -788,6 +857,7 @@
           <w:p>
             <w:pPr>
               <w:pStyle w:val="Compact"/>
+              <w:jc w:val="left"/>
             </w:pPr>
             <w:r>
               <w:t xml:space="preserve">Delivery channels; payloads carry titles, never document fields</w:t>
@@ -799,6 +869,7 @@
           <w:p>
             <w:pPr>
               <w:pStyle w:val="Compact"/>
+              <w:jc w:val="left"/>
             </w:pPr>
             <w:r>
               <w:t xml:space="preserve">Third party</w:t>
@@ -812,6 +883,7 @@
           <w:p>
             <w:pPr>
               <w:pStyle w:val="Compact"/>
+              <w:jc w:val="left"/>
             </w:pPr>
             <w:r>
               <w:t xml:space="preserve">Cloud LLM (optional)</w:t>
@@ -823,6 +895,7 @@
           <w:p>
             <w:pPr>
               <w:pStyle w:val="Compact"/>
+              <w:jc w:val="left"/>
             </w:pPr>
             <w:r>
               <w:t xml:space="preserve">Answers public procedure questions when enabled</w:t>
@@ -834,6 +907,7 @@
           <w:p>
             <w:pPr>
               <w:pStyle w:val="Compact"/>
+              <w:jc w:val="left"/>
             </w:pPr>
             <w:r>
               <w:t xml:space="preserve">Third party; PII forbidden (C1)</w:t>
@@ -842,8 +916,8 @@
         </w:tc>
       </w:tr>
     </w:tbl>
-    <w:bookmarkEnd w:id="14"/>
-    <w:bookmarkStart w:id="18" w:name="c4-level-2-containers"/>
+    <w:bookmarkEnd w:id="25"/>
+    <w:bookmarkStart w:id="29" w:name="c4-level-2-containers"/>
     <w:p>
       <w:pPr>
         <w:pStyle w:val="Heading1"/>
@@ -870,18 +944,18 @@
           <wp:inline>
             <wp:extent cx="5334000" cy="9627053"/>
             <wp:effectExtent b="0" l="0" r="0" t="0"/>
-            <wp:docPr descr="Containers" title="" id="16" name="Picture"/>
+            <wp:docPr descr="Containers" title="" id="27" name="Picture"/>
             <a:graphic>
               <a:graphicData uri="http://schemas.openxmlformats.org/drawingml/2006/picture">
                 <pic:pic>
                   <pic:nvPicPr>
-                    <pic:cNvPr descr="assets/c4-container.png" id="17" name="Picture"/>
+                    <pic:cNvPr descr="assets/c4-container.png" id="28" name="Picture"/>
                     <pic:cNvPicPr>
                       <a:picLocks noChangeArrowheads="1" noChangeAspect="1"/>
                     </pic:cNvPicPr>
                   </pic:nvPicPr>
                   <pic:blipFill>
-                    <a:blip r:embed="rId15"/>
+                    <a:blip r:embed="rId26"/>
                     <a:stretch>
                       <a:fillRect/>
                     </a:stretch>
@@ -1156,8 +1230,8 @@
       <w:tblPr>
         <w:tblStyle w:val="Table"/>
         <w:tblW w:type="pct" w:w="5000"/>
-        <w:tblLayout w:type="fixed"/>
         <w:tblLook w:firstRow="1" w:lastRow="0" w:firstColumn="0" w:lastColumn="0" w:noHBand="0" w:noVBand="0" w:val="0020"/>
+        <w:jc w:val="start"/>
       </w:tblPr>
       <w:tblGrid>
         <w:gridCol w:w="1980"/>
@@ -1167,13 +1241,14 @@
       </w:tblGrid>
       <w:tr>
         <w:trPr>
-          <w:tblHeader w:val="on"/>
+          <w:tblHeader w:val="true"/>
         </w:trPr>
         <w:tc>
           <w:tcPr/>
           <w:p>
             <w:pPr>
               <w:pStyle w:val="Compact"/>
+              <w:jc w:val="left"/>
             </w:pPr>
             <w:r>
               <w:t xml:space="preserve">Container</w:t>
@@ -1185,6 +1260,7 @@
           <w:p>
             <w:pPr>
               <w:pStyle w:val="Compact"/>
+              <w:jc w:val="left"/>
             </w:pPr>
             <w:r>
               <w:t xml:space="preserve">Technology</w:t>
@@ -1196,6 +1272,7 @@
           <w:p>
             <w:pPr>
               <w:pStyle w:val="Compact"/>
+              <w:jc w:val="left"/>
             </w:pPr>
             <w:r>
               <w:t xml:space="preserve">Notes</w:t>
@@ -1207,6 +1284,7 @@
           <w:p>
             <w:pPr>
               <w:pStyle w:val="Compact"/>
+              <w:jc w:val="left"/>
             </w:pPr>
             <w:r>
               <w:t xml:space="preserve">Status</w:t>
@@ -1220,6 +1298,7 @@
           <w:p>
             <w:pPr>
               <w:pStyle w:val="Compact"/>
+              <w:jc w:val="left"/>
             </w:pPr>
             <w:r>
               <w:t xml:space="preserve">Wathiq API</w:t>
@@ -1231,6 +1310,7 @@
           <w:p>
             <w:pPr>
               <w:pStyle w:val="Compact"/>
+              <w:jc w:val="left"/>
             </w:pPr>
             <w:r>
               <w:t xml:space="preserve">ABP, .NET 10, EF Core, OpenIddict</w:t>
@@ -1242,6 +1322,7 @@
           <w:p>
             <w:pPr>
               <w:pStyle w:val="Compact"/>
+              <w:jc w:val="left"/>
             </w:pPr>
             <w:r>
               <w:t xml:space="preserve">One process hosts all modules and Hangfire</w:t>
@@ -1253,6 +1334,7 @@
           <w:p>
             <w:pPr>
               <w:pStyle w:val="Compact"/>
+              <w:jc w:val="left"/>
             </w:pPr>
             <w:r>
               <w:t xml:space="preserve">Planned (P1)</w:t>
@@ -1266,6 +1348,7 @@
           <w:p>
             <w:pPr>
               <w:pStyle w:val="Compact"/>
+              <w:jc w:val="left"/>
             </w:pPr>
             <w:r>
               <w:t xml:space="preserve">SQL Server</w:t>
@@ -1277,6 +1360,7 @@
           <w:p>
             <w:pPr>
               <w:pStyle w:val="Compact"/>
+              <w:jc w:val="left"/>
             </w:pPr>
             <w:r>
               <w:t xml:space="preserve">Express (prod) / LocalDB (dev)</w:t>
@@ -1288,6 +1372,7 @@
           <w:p>
             <w:pPr>
               <w:pStyle w:val="Compact"/>
+              <w:jc w:val="left"/>
             </w:pPr>
             <w:r>
               <w:t xml:space="preserve">One database, one schema per module</w:t>
@@ -1299,6 +1384,7 @@
           <w:p>
             <w:pPr>
               <w:pStyle w:val="Compact"/>
+              <w:jc w:val="left"/>
             </w:pPr>
             <w:r>
               <w:t xml:space="preserve">Planned (P1)</w:t>
@@ -1312,6 +1398,7 @@
           <w:p>
             <w:pPr>
               <w:pStyle w:val="Compact"/>
+              <w:jc w:val="left"/>
             </w:pPr>
             <w:r>
               <w:t xml:space="preserve">File store</w:t>
@@ -1323,6 +1410,7 @@
           <w:p>
             <w:pPr>
               <w:pStyle w:val="Compact"/>
+              <w:jc w:val="left"/>
             </w:pPr>
             <w:r>
               <w:t xml:space="preserve">Local disk, AES-encrypted blobs</w:t>
@@ -1334,6 +1422,7 @@
           <w:p>
             <w:pPr>
               <w:pStyle w:val="Compact"/>
+              <w:jc w:val="left"/>
             </w:pPr>
             <w:r>
               <w:t xml:space="preserve">Key outside the data volume (NFR-SEC-001); S3-compatible later</w:t>
@@ -1345,6 +1434,7 @@
           <w:p>
             <w:pPr>
               <w:pStyle w:val="Compact"/>
+              <w:jc w:val="left"/>
             </w:pPr>
             <w:r>
               <w:t xml:space="preserve">Planned (P1, encryption P8)</w:t>
@@ -1358,6 +1448,7 @@
           <w:p>
             <w:pPr>
               <w:pStyle w:val="Compact"/>
+              <w:jc w:val="left"/>
             </w:pPr>
             <w:r>
               <w:t xml:space="preserve">Ollama</w:t>
@@ -1369,6 +1460,7 @@
           <w:p>
             <w:pPr>
               <w:pStyle w:val="Compact"/>
+              <w:jc w:val="left"/>
             </w:pPr>
             <w:r>
               <w:t xml:space="preserve">qwen2.5:7b, qwen2.5vl:7b, bge-m3</w:t>
@@ -1380,6 +1472,7 @@
           <w:p>
             <w:pPr>
               <w:pStyle w:val="Compact"/>
+              <w:jc w:val="left"/>
             </w:pPr>
             <w:r>
               <w:t xml:space="preserve">Only container allowed to see document data</w:t>
@@ -1391,6 +1484,7 @@
           <w:p>
             <w:pPr>
               <w:pStyle w:val="Compact"/>
+              <w:jc w:val="left"/>
             </w:pPr>
             <w:r>
               <w:t xml:space="preserve">Planned (P3)</w:t>
@@ -1404,6 +1498,7 @@
           <w:p>
             <w:pPr>
               <w:pStyle w:val="Compact"/>
+              <w:jc w:val="left"/>
             </w:pPr>
             <w:r>
               <w:t xml:space="preserve">Tesseract</w:t>
@@ -1415,6 +1510,7 @@
           <w:p>
             <w:pPr>
               <w:pStyle w:val="Compact"/>
+              <w:jc w:val="left"/>
             </w:pPr>
             <w:r>
               <w:t xml:space="preserve">ara+eng</w:t>
@@ -1426,6 +1522,7 @@
           <w:p>
             <w:pPr>
               <w:pStyle w:val="Compact"/>
+              <w:jc w:val="left"/>
             </w:pPr>
             <w:r>
               <w:t xml:space="preserve">Deterministic OCR before the LLM (D5)</w:t>
@@ -1437,6 +1534,7 @@
           <w:p>
             <w:pPr>
               <w:pStyle w:val="Compact"/>
+              <w:jc w:val="left"/>
             </w:pPr>
             <w:r>
               <w:t xml:space="preserve">Planned (P3)</w:t>
@@ -1450,6 +1548,7 @@
           <w:p>
             <w:pPr>
               <w:pStyle w:val="Compact"/>
+              <w:jc w:val="left"/>
             </w:pPr>
             <w:r>
               <w:t xml:space="preserve">wathiq_portal / wathiq_admin</w:t>
@@ -1461,6 +1560,7 @@
           <w:p>
             <w:pPr>
               <w:pStyle w:val="Compact"/>
+              <w:jc w:val="left"/>
             </w:pPr>
             <w:r>
               <w:t xml:space="preserve">Angular 20, Nx, Tailwind 4</w:t>
@@ -1472,6 +1572,7 @@
           <w:p>
             <w:pPr>
               <w:pStyle w:val="Compact"/>
+              <w:jc w:val="left"/>
             </w:pPr>
             <w:r>
               <w:t xml:space="preserve">Two apps, shared Nx libs</w:t>
@@ -1483,6 +1584,7 @@
           <w:p>
             <w:pPr>
               <w:pStyle w:val="Compact"/>
+              <w:jc w:val="left"/>
             </w:pPr>
             <w:r>
               <w:t xml:space="preserve">Planned (P4, P7)</w:t>
@@ -1496,6 +1598,7 @@
           <w:p>
             <w:pPr>
               <w:pStyle w:val="Compact"/>
+              <w:jc w:val="left"/>
             </w:pPr>
             <w:r>
               <w:t xml:space="preserve">Wathiq mobile</w:t>
@@ -1507,6 +1610,7 @@
           <w:p>
             <w:pPr>
               <w:pStyle w:val="Compact"/>
+              <w:jc w:val="left"/>
             </w:pPr>
             <w:r>
               <w:t xml:space="preserve">Flutter, Riverpod, Drift</w:t>
@@ -1518,6 +1622,7 @@
           <w:p>
             <w:pPr>
               <w:pStyle w:val="Compact"/>
+              <w:jc w:val="left"/>
             </w:pPr>
             <w:r>
               <w:t xml:space="preserve">Offline-first</w:t>
@@ -1529,6 +1634,7 @@
           <w:p>
             <w:pPr>
               <w:pStyle w:val="Compact"/>
+              <w:jc w:val="left"/>
             </w:pPr>
             <w:r>
               <w:t xml:space="preserve">Planned (P6)</w:t>
@@ -1537,8 +1643,8 @@
         </w:tc>
       </w:tr>
     </w:tbl>
-    <w:bookmarkEnd w:id="18"/>
-    <w:bookmarkStart w:id="22" w:name="c4-level-3-modules-components-of-the-api"/>
+    <w:bookmarkEnd w:id="29"/>
+    <w:bookmarkStart w:id="33" w:name="c4-level-3-modules-components-of-the-api"/>
     <w:p>
       <w:pPr>
         <w:pStyle w:val="Heading1"/>
@@ -1565,18 +1671,18 @@
           <wp:inline>
             <wp:extent cx="5334000" cy="4167834"/>
             <wp:effectExtent b="0" l="0" r="0" t="0"/>
-            <wp:docPr descr="Module map" title="" id="20" name="Picture"/>
+            <wp:docPr descr="Module map" title="" id="31" name="Picture"/>
             <a:graphic>
               <a:graphicData uri="http://schemas.openxmlformats.org/drawingml/2006/picture">
                 <pic:pic>
                   <pic:nvPicPr>
-                    <pic:cNvPr descr="assets/module-map.png" id="21" name="Picture"/>
+                    <pic:cNvPr descr="assets/module-map.png" id="32" name="Picture"/>
                     <pic:cNvPicPr>
                       <a:picLocks noChangeArrowheads="1" noChangeAspect="1"/>
                     </pic:cNvPicPr>
                   </pic:nvPicPr>
                   <pic:blipFill>
-                    <a:blip r:embed="rId19"/>
+                    <a:blip r:embed="rId30"/>
                     <a:stretch>
                       <a:fillRect/>
                     </a:stretch>
@@ -1859,8 +1965,8 @@
       <w:tblPr>
         <w:tblStyle w:val="Table"/>
         <w:tblW w:type="pct" w:w="5000"/>
-        <w:tblLayout w:type="fixed"/>
         <w:tblLook w:firstRow="1" w:lastRow="0" w:firstColumn="0" w:lastColumn="0" w:noHBand="0" w:noVBand="0" w:val="0020"/>
+        <w:jc w:val="start"/>
       </w:tblPr>
       <w:tblGrid>
         <w:gridCol w:w="1980"/>
@@ -1870,13 +1976,14 @@
       </w:tblGrid>
       <w:tr>
         <w:trPr>
-          <w:tblHeader w:val="on"/>
+          <w:tblHeader w:val="true"/>
         </w:trPr>
         <w:tc>
           <w:tcPr/>
           <w:p>
             <w:pPr>
               <w:pStyle w:val="Compact"/>
+              <w:jc w:val="left"/>
             </w:pPr>
             <w:r>
               <w:t xml:space="preserve">Module</w:t>
@@ -1888,6 +1995,7 @@
           <w:p>
             <w:pPr>
               <w:pStyle w:val="Compact"/>
+              <w:jc w:val="left"/>
             </w:pPr>
             <w:r>
               <w:t xml:space="preserve">Owns</w:t>
@@ -1899,6 +2007,7 @@
           <w:p>
             <w:pPr>
               <w:pStyle w:val="Compact"/>
+              <w:jc w:val="left"/>
             </w:pPr>
             <w:r>
               <w:t xml:space="preserve">Exposes to other modules</w:t>
@@ -1910,6 +2019,7 @@
           <w:p>
             <w:pPr>
               <w:pStyle w:val="Compact"/>
+              <w:jc w:val="left"/>
             </w:pPr>
             <w:r>
               <w:t xml:space="preserve">Depends on</w:t>
@@ -1923,6 +2033,7 @@
           <w:p>
             <w:pPr>
               <w:pStyle w:val="Compact"/>
+              <w:jc w:val="left"/>
             </w:pPr>
             <w:r>
               <w:t xml:space="preserve">Identity</w:t>
@@ -1934,6 +2045,7 @@
           <w:p>
             <w:pPr>
               <w:pStyle w:val="Compact"/>
+              <w:jc w:val="left"/>
             </w:pPr>
             <w:r>
               <w:t xml:space="preserve">Users, roles, family links (ABP Identity)</w:t>
@@ -1945,6 +2057,7 @@
           <w:p>
             <w:pPr>
               <w:pStyle w:val="Compact"/>
+              <w:jc w:val="left"/>
             </w:pPr>
             <w:r>
               <w:rPr>
@@ -1962,6 +2075,7 @@
           <w:p>
             <w:pPr>
               <w:pStyle w:val="Compact"/>
+              <w:jc w:val="left"/>
             </w:pPr>
             <w:r>
               <w:t xml:space="preserve">—</w:t>
@@ -1975,6 +2089,7 @@
           <w:p>
             <w:pPr>
               <w:pStyle w:val="Compact"/>
+              <w:jc w:val="left"/>
             </w:pPr>
             <w:r>
               <w:t xml:space="preserve">Documents</w:t>
@@ -1986,6 +2101,7 @@
           <w:p>
             <w:pPr>
               <w:pStyle w:val="Compact"/>
+              <w:jc w:val="left"/>
             </w:pPr>
             <w:r>
               <w:t xml:space="preserve">DocumentType, Holder, Document, Attachment, ExtractionResult</w:t>
@@ -1997,6 +2113,7 @@
           <w:p>
             <w:pPr>
               <w:pStyle w:val="Compact"/>
+              <w:jc w:val="left"/>
             </w:pPr>
             <w:r>
               <w:rPr>
@@ -2026,6 +2143,7 @@
           <w:p>
             <w:pPr>
               <w:pStyle w:val="Compact"/>
+              <w:jc w:val="left"/>
             </w:pPr>
             <w:r>
               <w:t xml:space="preserve">Ai, Shared</w:t>
@@ -2039,6 +2157,7 @@
           <w:p>
             <w:pPr>
               <w:pStyle w:val="Compact"/>
+              <w:jc w:val="left"/>
             </w:pPr>
             <w:r>
               <w:t xml:space="preserve">Reminders</w:t>
@@ -2050,6 +2169,7 @@
           <w:p>
             <w:pPr>
               <w:pStyle w:val="Compact"/>
+              <w:jc w:val="left"/>
             </w:pPr>
             <w:r>
               <w:t xml:space="preserve">ReminderRule, Reminder, DeliveryLog; nightly job</w:t>
@@ -2061,6 +2181,7 @@
           <w:p>
             <w:pPr>
               <w:pStyle w:val="Compact"/>
+              <w:jc w:val="left"/>
             </w:pPr>
             <w:r>
               <w:t xml:space="preserve">—</w:t>
@@ -2072,6 +2193,7 @@
           <w:p>
             <w:pPr>
               <w:pStyle w:val="Compact"/>
+              <w:jc w:val="left"/>
             </w:pPr>
             <w:r>
               <w:t xml:space="preserve">Documents (events + lookup), Shared</w:t>
@@ -2085,6 +2207,7 @@
           <w:p>
             <w:pPr>
               <w:pStyle w:val="Compact"/>
+              <w:jc w:val="left"/>
             </w:pPr>
             <w:r>
               <w:t xml:space="preserve">Guides</w:t>
@@ -2096,6 +2219,7 @@
           <w:p>
             <w:pPr>
               <w:pStyle w:val="Compact"/>
+              <w:jc w:val="left"/>
             </w:pPr>
             <w:r>
               <w:t xml:space="preserve">Guide, GuideVersion, GuideStep, GuideChunk (+embedding), Feedback</w:t>
@@ -2107,6 +2231,7 @@
           <w:p>
             <w:pPr>
               <w:pStyle w:val="Compact"/>
+              <w:jc w:val="left"/>
             </w:pPr>
             <w:r>
               <w:rPr>
@@ -2121,6 +2246,7 @@
           <w:p>
             <w:pPr>
               <w:pStyle w:val="Compact"/>
+              <w:jc w:val="left"/>
             </w:pPr>
             <w:r>
               <w:t xml:space="preserve">Ai, Shared</w:t>
@@ -2134,6 +2260,7 @@
           <w:p>
             <w:pPr>
               <w:pStyle w:val="Compact"/>
+              <w:jc w:val="left"/>
             </w:pPr>
             <w:r>
               <w:t xml:space="preserve">Ai</w:t>
@@ -2145,6 +2272,7 @@
           <w:p>
             <w:pPr>
               <w:pStyle w:val="Compact"/>
+              <w:jc w:val="left"/>
             </w:pPr>
             <w:r>
               <w:t xml:space="preserve">Provider routing, prompts, Usage, caps, eval samples</w:t>
@@ -2156,6 +2284,7 @@
           <w:p>
             <w:pPr>
               <w:pStyle w:val="Compact"/>
+              <w:jc w:val="left"/>
             </w:pPr>
             <w:r>
               <w:rPr>
@@ -2194,6 +2323,7 @@
           <w:p>
             <w:pPr>
               <w:pStyle w:val="Compact"/>
+              <w:jc w:val="left"/>
             </w:pPr>
             <w:r>
               <w:t xml:space="preserve">Shared</w:t>
@@ -2207,6 +2337,7 @@
           <w:p>
             <w:pPr>
               <w:pStyle w:val="Compact"/>
+              <w:jc w:val="left"/>
             </w:pPr>
             <w:r>
               <w:t xml:space="preserve">Shared</w:t>
@@ -2218,6 +2349,7 @@
           <w:p>
             <w:pPr>
               <w:pStyle w:val="Compact"/>
+              <w:jc w:val="left"/>
             </w:pPr>
             <w:r>
               <w:t xml:space="preserve">File storage abstraction, localization, audit, encryption</w:t>
@@ -2229,6 +2361,7 @@
           <w:p>
             <w:pPr>
               <w:pStyle w:val="Compact"/>
+              <w:jc w:val="left"/>
             </w:pPr>
             <w:r>
               <w:rPr>
@@ -2255,6 +2388,7 @@
           <w:p>
             <w:pPr>
               <w:pStyle w:val="Compact"/>
+              <w:jc w:val="left"/>
             </w:pPr>
             <w:r>
               <w:t xml:space="preserve">—</w:t>
@@ -2269,24 +2403,24 @@
       </w:pPr>
       <w:r>
         <w:rPr>
+          <w:bCs/>
           <w:b/>
-          <w:bCs/>
         </w:rPr>
         <w:t xml:space="preserve">Module rules</w:t>
       </w:r>
     </w:p>
     <w:p>
       <w:pPr>
-        <w:pStyle w:val="Compact"/>
         <w:numPr>
           <w:ilvl w:val="0"/>
           <w:numId w:val="1001"/>
         </w:numPr>
-      </w:pPr>
-      <w:r>
-        <w:rPr>
+        <w:pStyle w:val="Compact"/>
+      </w:pPr>
+      <w:r>
+        <w:rPr>
+          <w:bCs/>
           <w:b/>
-          <w:bCs/>
         </w:rPr>
         <w:t xml:space="preserve">No cross-module DB joins.</w:t>
       </w:r>
@@ -2347,11 +2481,11 @@
     </w:p>
     <w:p>
       <w:pPr>
-        <w:pStyle w:val="Compact"/>
         <w:numPr>
           <w:ilvl w:val="0"/>
           <w:numId w:val="1001"/>
         </w:numPr>
+        <w:pStyle w:val="Compact"/>
       </w:pPr>
       <w:r>
         <w:t xml:space="preserve">Cross-module reads go through an application-service interface in the owning module</w:t>
@@ -2374,11 +2508,11 @@
     </w:p>
     <w:p>
       <w:pPr>
-        <w:pStyle w:val="Compact"/>
         <w:numPr>
           <w:ilvl w:val="0"/>
           <w:numId w:val="1001"/>
         </w:numPr>
+        <w:pStyle w:val="Compact"/>
       </w:pPr>
       <w:r>
         <w:t xml:space="preserve">Cross-module reactions go through ABP local events (</w:t>
@@ -2398,11 +2532,11 @@
     </w:p>
     <w:p>
       <w:pPr>
-        <w:pStyle w:val="Compact"/>
         <w:numPr>
           <w:ilvl w:val="0"/>
           <w:numId w:val="1001"/>
         </w:numPr>
+        <w:pStyle w:val="Compact"/>
       </w:pPr>
       <w:r>
         <w:t xml:space="preserve">Foreign keys across schemas are stored as plain</w:t>
@@ -2431,11 +2565,11 @@
     </w:p>
     <w:p>
       <w:pPr>
-        <w:pStyle w:val="Compact"/>
         <w:numPr>
           <w:ilvl w:val="0"/>
           <w:numId w:val="1001"/>
         </w:numPr>
+        <w:pStyle w:val="Compact"/>
       </w:pPr>
       <w:r>
         <w:t xml:space="preserve">Only</w:t>
@@ -2468,8 +2602,8 @@
         <w:t xml:space="preserve">; no provider SDK type appears outside it.</w:t>
       </w:r>
     </w:p>
-    <w:bookmarkEnd w:id="22"/>
-    <w:bookmarkStart w:id="35" w:name="key-flows"/>
+    <w:bookmarkEnd w:id="33"/>
+    <w:bookmarkStart w:id="46" w:name="key-flows"/>
     <w:p>
       <w:pPr>
         <w:pStyle w:val="Heading1"/>
@@ -2487,7 +2621,7 @@
         <w:t xml:space="preserve">Key flows</w:t>
       </w:r>
     </w:p>
-    <w:bookmarkStart w:id="26" w:name="add-a-document-with-extraction-uc-01"/>
+    <w:bookmarkStart w:id="37" w:name="add-a-document-with-extraction-uc-01"/>
     <w:p>
       <w:pPr>
         <w:pStyle w:val="Heading2"/>
@@ -2514,18 +2648,18 @@
           <wp:inline>
             <wp:extent cx="5334000" cy="2694214"/>
             <wp:effectExtent b="0" l="0" r="0" t="0"/>
-            <wp:docPr descr="Add document flow" title="" id="24" name="Picture"/>
+            <wp:docPr descr="Add document flow" title="" id="35" name="Picture"/>
             <a:graphic>
               <a:graphicData uri="http://schemas.openxmlformats.org/drawingml/2006/picture">
                 <pic:pic>
                   <pic:nvPicPr>
-                    <pic:cNvPr descr="assets/flow-add-document.png" id="25" name="Picture"/>
+                    <pic:cNvPr descr="assets/flow-add-document.png" id="36" name="Picture"/>
                     <pic:cNvPicPr>
                       <a:picLocks noChangeArrowheads="1" noChangeAspect="1"/>
                     </pic:cNvPicPr>
                   </pic:nvPicPr>
                   <pic:blipFill>
-                    <a:blip r:embed="rId23"/>
+                    <a:blip r:embed="rId34"/>
                     <a:stretch>
                       <a:fillRect/>
                     </a:stretch>
@@ -2742,8 +2876,8 @@
         <w:t xml:space="preserve">  D--&gt;&gt;D: publish DocumentExpiryChanged (local event)</w:t>
       </w:r>
     </w:p>
-    <w:bookmarkEnd w:id="26"/>
-    <w:bookmarkStart w:id="30" w:name="nightly-reminder-run-uc-02"/>
+    <w:bookmarkEnd w:id="37"/>
+    <w:bookmarkStart w:id="41" w:name="nightly-reminder-run-uc-02"/>
     <w:p>
       <w:pPr>
         <w:pStyle w:val="Heading2"/>
@@ -2770,18 +2904,18 @@
           <wp:inline>
             <wp:extent cx="5334000" cy="2354035"/>
             <wp:effectExtent b="0" l="0" r="0" t="0"/>
-            <wp:docPr descr="Reminder run" title="" id="28" name="Picture"/>
+            <wp:docPr descr="Reminder run" title="" id="39" name="Picture"/>
             <a:graphic>
               <a:graphicData uri="http://schemas.openxmlformats.org/drawingml/2006/picture">
                 <pic:pic>
                   <pic:nvPicPr>
-                    <pic:cNvPr descr="assets/flow-reminder-run.png" id="29" name="Picture"/>
+                    <pic:cNvPr descr="assets/flow-reminder-run.png" id="40" name="Picture"/>
                     <pic:cNvPicPr>
                       <a:picLocks noChangeArrowheads="1" noChangeAspect="1"/>
                     </pic:cNvPicPr>
                   </pic:nvPicPr>
                   <pic:blipFill>
-                    <a:blip r:embed="rId27"/>
+                    <a:blip r:embed="rId38"/>
                     <a:stretch>
                       <a:fillRect/>
                     </a:stretch>
@@ -2967,8 +3101,109 @@
         <w:t xml:space="preserve">status, so a second run on the same day finds nothing Pending (FR-REM-002).</w:t>
       </w:r>
     </w:p>
-    <w:bookmarkEnd w:id="30"/>
-    <w:bookmarkStart w:id="34" w:name="grounded-renewal-answer-uc-03"/>
+    <w:p>
+      <w:pPr>
+        <w:pStyle w:val="BlockText"/>
+      </w:pPr>
+      <w:r>
+        <w:rPr>
+          <w:bCs/>
+          <w:b/>
+        </w:rPr>
+        <w:t xml:space="preserve">As built (Phase 2):</w:t>
+      </w:r>
+      <w:r>
+        <w:t xml:space="preserve"> </w:t>
+      </w:r>
+      <w:r>
+        <w:t xml:space="preserve">the run needs no</w:t>
+      </w:r>
+      <w:r>
+        <w:t xml:space="preserve"> </w:t>
+      </w:r>
+      <w:r>
+        <w:rPr>
+          <w:rStyle w:val="VerbatimChar"/>
+        </w:rPr>
+        <w:t xml:space="preserve">Documents.IDocumentLookup</w:t>
+      </w:r>
+      <w:r>
+        <w:t xml:space="preserve"> </w:t>
+      </w:r>
+      <w:r>
+        <w:t xml:space="preserve">— the</w:t>
+      </w:r>
+      <w:r>
+        <w:t xml:space="preserve"> </w:t>
+      </w:r>
+      <w:r>
+        <w:rPr>
+          <w:rStyle w:val="VerbatimChar"/>
+        </w:rPr>
+        <w:t xml:space="preserve">DocumentExpiryChanged</w:t>
+      </w:r>
+      <w:r>
+        <w:t xml:space="preserve"> </w:t>
+      </w:r>
+      <w:r>
+        <w:t xml:space="preserve">local event (2.4) keeps</w:t>
+      </w:r>
+      <w:r>
+        <w:t xml:space="preserve"> </w:t>
+      </w:r>
+      <w:r>
+        <w:rPr>
+          <w:rStyle w:val="VerbatimChar"/>
+        </w:rPr>
+        <w:t xml:space="preserve">Reminder</w:t>
+      </w:r>
+      <w:r>
+        <w:t xml:space="preserve"> </w:t>
+      </w:r>
+      <w:r>
+        <w:t xml:space="preserve">rows synced</w:t>
+      </w:r>
+      <w:r>
+        <w:t xml:space="preserve"> </w:t>
+      </w:r>
+      <w:r>
+        <w:rPr>
+          <w:iCs/>
+          <w:i/>
+        </w:rPr>
+        <w:t xml:space="preserve">ahead of time</w:t>
+      </w:r>
+      <w:r>
+        <w:t xml:space="preserve">, so the</w:t>
+      </w:r>
+      <w:r>
+        <w:t xml:space="preserve"> </w:t>
+      </w:r>
+      <w:r>
+        <w:t xml:space="preserve">job only dispatches what is already due; and it runs</w:t>
+      </w:r>
+      <w:r>
+        <w:t xml:space="preserve"> </w:t>
+      </w:r>
+      <w:r>
+        <w:rPr>
+          <w:bCs/>
+          <w:b/>
+        </w:rPr>
+        <w:t xml:space="preserve">hourly</w:t>
+      </w:r>
+      <w:r>
+        <w:t xml:space="preserve">, not nightly, so quiet hours</w:t>
+      </w:r>
+      <w:r>
+        <w:t xml:space="preserve"> </w:t>
+      </w:r>
+      <w:r>
+        <w:t xml:space="preserve">can defer delivery (2.6). Diagram refresh comes with the Phase 3 architecture update (PLAN §7).</w:t>
+      </w:r>
+    </w:p>
+    <w:bookmarkEnd w:id="41"/>
+    <w:bookmarkStart w:id="45" w:name="grounded-renewal-answer-uc-03"/>
     <w:p>
       <w:pPr>
         <w:pStyle w:val="Heading2"/>
@@ -2995,18 +3230,18 @@
           <wp:inline>
             <wp:extent cx="5334000" cy="3116035"/>
             <wp:effectExtent b="0" l="0" r="0" t="0"/>
-            <wp:docPr descr="RAG answer" title="" id="32" name="Picture"/>
+            <wp:docPr descr="RAG answer" title="" id="43" name="Picture"/>
             <a:graphic>
               <a:graphicData uri="http://schemas.openxmlformats.org/drawingml/2006/picture">
                 <pic:pic>
                   <pic:nvPicPr>
-                    <pic:cNvPr descr="assets/flow-rag-answer.png" id="33" name="Picture"/>
+                    <pic:cNvPr descr="assets/flow-rag-answer.png" id="44" name="Picture"/>
                     <pic:cNvPicPr>
                       <a:picLocks noChangeArrowheads="1" noChangeAspect="1"/>
                     </pic:cNvPicPr>
                   </pic:nvPicPr>
                   <pic:blipFill>
-                    <a:blip r:embed="rId31"/>
+                    <a:blip r:embed="rId42"/>
                     <a:stretch>
                       <a:fillRect/>
                     </a:stretch>
@@ -3214,9 +3449,9 @@
         <w:t xml:space="preserve">  end</w:t>
       </w:r>
     </w:p>
-    <w:bookmarkEnd w:id="34"/>
-    <w:bookmarkEnd w:id="35"/>
-    <w:bookmarkStart w:id="36" w:name="cross-cutting-concerns"/>
+    <w:bookmarkEnd w:id="45"/>
+    <w:bookmarkEnd w:id="46"/>
+    <w:bookmarkStart w:id="47" w:name="cross-cutting-concerns"/>
     <w:p>
       <w:pPr>
         <w:pStyle w:val="Heading1"/>
@@ -3238,8 +3473,8 @@
       <w:tblPr>
         <w:tblStyle w:val="Table"/>
         <w:tblW w:type="pct" w:w="5000"/>
-        <w:tblLayout w:type="fixed"/>
         <w:tblLook w:firstRow="1" w:lastRow="0" w:firstColumn="0" w:lastColumn="0" w:noHBand="0" w:noVBand="0" w:val="0020"/>
+        <w:jc w:val="start"/>
       </w:tblPr>
       <w:tblGrid>
         <w:gridCol w:w="2640"/>
@@ -3248,13 +3483,14 @@
       </w:tblGrid>
       <w:tr>
         <w:trPr>
-          <w:tblHeader w:val="on"/>
+          <w:tblHeader w:val="true"/>
         </w:trPr>
         <w:tc>
           <w:tcPr/>
           <w:p>
             <w:pPr>
               <w:pStyle w:val="Compact"/>
+              <w:jc w:val="left"/>
             </w:pPr>
             <w:r>
               <w:t xml:space="preserve">Concern</w:t>
@@ -3266,6 +3502,7 @@
           <w:p>
             <w:pPr>
               <w:pStyle w:val="Compact"/>
+              <w:jc w:val="left"/>
             </w:pPr>
             <w:r>
               <w:t xml:space="preserve">Approach</w:t>
@@ -3277,6 +3514,7 @@
           <w:p>
             <w:pPr>
               <w:pStyle w:val="Compact"/>
+              <w:jc w:val="left"/>
             </w:pPr>
             <w:r>
               <w:t xml:space="preserve">Status</w:t>
@@ -3290,6 +3528,7 @@
           <w:p>
             <w:pPr>
               <w:pStyle w:val="Compact"/>
+              <w:jc w:val="left"/>
             </w:pPr>
             <w:r>
               <w:t xml:space="preserve">Authentication</w:t>
@@ -3301,6 +3540,7 @@
           <w:p>
             <w:pPr>
               <w:pStyle w:val="Compact"/>
+              <w:jc w:val="left"/>
             </w:pPr>
             <w:r>
               <w:t xml:space="preserve">OpenIddict (ABP), OIDC code flow for web, password/refresh for mobile</w:t>
@@ -3312,6 +3552,7 @@
           <w:p>
             <w:pPr>
               <w:pStyle w:val="Compact"/>
+              <w:jc w:val="left"/>
             </w:pPr>
             <w:r>
               <w:t xml:space="preserve">Planned (P1)</w:t>
@@ -3325,6 +3566,7 @@
           <w:p>
             <w:pPr>
               <w:pStyle w:val="Compact"/>
+              <w:jc w:val="left"/>
             </w:pPr>
             <w:r>
               <w:t xml:space="preserve">Authorization</w:t>
@@ -3336,6 +3578,7 @@
           <w:p>
             <w:pPr>
               <w:pStyle w:val="Compact"/>
+              <w:jc w:val="left"/>
             </w:pPr>
             <w:r>
               <w:t xml:space="preserve">ABP permissions per module; data filtered by owner user id</w:t>
@@ -3347,6 +3590,7 @@
           <w:p>
             <w:pPr>
               <w:pStyle w:val="Compact"/>
+              <w:jc w:val="left"/>
             </w:pPr>
             <w:r>
               <w:t xml:space="preserve">Planned (P1)</w:t>
@@ -3360,6 +3604,7 @@
           <w:p>
             <w:pPr>
               <w:pStyle w:val="Compact"/>
+              <w:jc w:val="left"/>
             </w:pPr>
             <w:r>
               <w:t xml:space="preserve">Privacy routing</w:t>
@@ -3371,6 +3616,7 @@
           <w:p>
             <w:pPr>
               <w:pStyle w:val="Compact"/>
+              <w:jc w:val="left"/>
             </w:pPr>
             <w:r>
               <w:rPr>
@@ -3389,8 +3635,8 @@
             </w:r>
             <w:r>
               <w:rPr>
+                <w:iCs/>
                 <w:i/>
-                <w:iCs/>
               </w:rPr>
               <w:t xml:space="preserve">purpose</w:t>
             </w:r>
@@ -3434,6 +3680,7 @@
           <w:p>
             <w:pPr>
               <w:pStyle w:val="Compact"/>
+              <w:jc w:val="left"/>
             </w:pPr>
             <w:r>
               <w:t xml:space="preserve">Planned (P3)</w:t>
@@ -3447,6 +3694,7 @@
           <w:p>
             <w:pPr>
               <w:pStyle w:val="Compact"/>
+              <w:jc w:val="left"/>
             </w:pPr>
             <w:r>
               <w:t xml:space="preserve">Usage caps</w:t>
@@ -3458,6 +3706,7 @@
           <w:p>
             <w:pPr>
               <w:pStyle w:val="Compact"/>
+              <w:jc w:val="left"/>
             </w:pPr>
             <w:r>
               <w:rPr>
@@ -3478,6 +3727,7 @@
           <w:p>
             <w:pPr>
               <w:pStyle w:val="Compact"/>
+              <w:jc w:val="left"/>
             </w:pPr>
             <w:r>
               <w:t xml:space="preserve">Planned (P3)</w:t>
@@ -3491,6 +3741,7 @@
           <w:p>
             <w:pPr>
               <w:pStyle w:val="Compact"/>
+              <w:jc w:val="left"/>
             </w:pPr>
             <w:r>
               <w:t xml:space="preserve">Localization</w:t>
@@ -3502,6 +3753,7 @@
           <w:p>
             <w:pPr>
               <w:pStyle w:val="Compact"/>
+              <w:jc w:val="left"/>
             </w:pPr>
             <w:r>
               <w:t xml:space="preserve">ABP localization JSON (ar, en); clients carry their own</w:t>
@@ -3531,6 +3783,7 @@
           <w:p>
             <w:pPr>
               <w:pStyle w:val="Compact"/>
+              <w:jc w:val="left"/>
             </w:pPr>
             <w:r>
               <w:t xml:space="preserve">Planned (P1, P4)</w:t>
@@ -3544,6 +3797,7 @@
           <w:p>
             <w:pPr>
               <w:pStyle w:val="Compact"/>
+              <w:jc w:val="left"/>
             </w:pPr>
             <w:r>
               <w:t xml:space="preserve">Files</w:t>
@@ -3555,6 +3809,7 @@
           <w:p>
             <w:pPr>
               <w:pStyle w:val="Compact"/>
+              <w:jc w:val="left"/>
             </w:pPr>
             <w:r>
               <w:rPr>
@@ -3575,6 +3830,7 @@
           <w:p>
             <w:pPr>
               <w:pStyle w:val="Compact"/>
+              <w:jc w:val="left"/>
             </w:pPr>
             <w:r>
               <w:t xml:space="preserve">Planned (P1)</w:t>
@@ -3588,6 +3844,7 @@
           <w:p>
             <w:pPr>
               <w:pStyle w:val="Compact"/>
+              <w:jc w:val="left"/>
             </w:pPr>
             <w:r>
               <w:t xml:space="preserve">Observability</w:t>
@@ -3599,6 +3856,7 @@
           <w:p>
             <w:pPr>
               <w:pStyle w:val="Compact"/>
+              <w:jc w:val="left"/>
             </w:pPr>
             <w:r>
               <w:t xml:space="preserve">Serilog → Seq; health checks; Hangfire dashboard (admin only)</w:t>
@@ -3610,6 +3868,7 @@
           <w:p>
             <w:pPr>
               <w:pStyle w:val="Compact"/>
+              <w:jc w:val="left"/>
             </w:pPr>
             <w:r>
               <w:t xml:space="preserve">Planned (P7)</w:t>
@@ -3623,6 +3882,7 @@
           <w:p>
             <w:pPr>
               <w:pStyle w:val="Compact"/>
+              <w:jc w:val="left"/>
             </w:pPr>
             <w:r>
               <w:t xml:space="preserve">Deployment</w:t>
@@ -3634,6 +3894,7 @@
           <w:p>
             <w:pPr>
               <w:pStyle w:val="Compact"/>
+              <w:jc w:val="left"/>
             </w:pPr>
             <w:r>
               <w:t xml:space="preserve">Docker Compose: api, sql, ollama; volumes for data/files/models</w:t>
@@ -3645,6 +3906,7 @@
           <w:p>
             <w:pPr>
               <w:pStyle w:val="Compact"/>
+              <w:jc w:val="left"/>
             </w:pPr>
             <w:r>
               <w:t xml:space="preserve">Planned (P0.6 skeleton, P7)</w:t>
@@ -3653,8 +3915,8 @@
         </w:tc>
       </w:tr>
     </w:tbl>
-    <w:bookmarkEnd w:id="36"/>
-    <w:bookmarkStart w:id="37" w:name="decisions-log"/>
+    <w:bookmarkEnd w:id="47"/>
+    <w:bookmarkStart w:id="48" w:name="decisions-log"/>
     <w:p>
       <w:pPr>
         <w:pStyle w:val="Heading1"/>
@@ -3711,8 +3973,8 @@
       <w:tblPr>
         <w:tblStyle w:val="Table"/>
         <w:tblW w:type="pct" w:w="5000"/>
-        <w:tblLayout w:type="fixed"/>
         <w:tblLook w:firstRow="1" w:lastRow="0" w:firstColumn="0" w:lastColumn="0" w:noHBand="0" w:noVBand="0" w:val="0020"/>
+        <w:jc w:val="start"/>
       </w:tblPr>
       <w:tblGrid>
         <w:gridCol w:w="2640"/>
@@ -3721,13 +3983,14 @@
       </w:tblGrid>
       <w:tr>
         <w:trPr>
-          <w:tblHeader w:val="on"/>
+          <w:tblHeader w:val="true"/>
         </w:trPr>
         <w:tc>
           <w:tcPr/>
           <w:p>
             <w:pPr>
               <w:pStyle w:val="Compact"/>
+              <w:jc w:val="left"/>
             </w:pPr>
             <w:r>
               <w:t xml:space="preserve">ID</w:t>
@@ -3739,6 +4002,7 @@
           <w:p>
             <w:pPr>
               <w:pStyle w:val="Compact"/>
+              <w:jc w:val="left"/>
             </w:pPr>
             <w:r>
               <w:t xml:space="preserve">Decision</w:t>
@@ -3750,6 +4014,7 @@
           <w:p>
             <w:pPr>
               <w:pStyle w:val="Compact"/>
+              <w:jc w:val="left"/>
             </w:pPr>
             <w:r>
               <w:t xml:space="preserve">Consequence</w:t>
@@ -3763,6 +4028,7 @@
           <w:p>
             <w:pPr>
               <w:pStyle w:val="Compact"/>
+              <w:jc w:val="left"/>
             </w:pPr>
             <w:r>
               <w:t xml:space="preserve">D1</w:t>
@@ -3774,6 +4040,7 @@
           <w:p>
             <w:pPr>
               <w:pStyle w:val="Compact"/>
+              <w:jc w:val="left"/>
             </w:pPr>
             <w:r>
               <w:t xml:space="preserve">ABP modular monolith</w:t>
@@ -3785,6 +4052,7 @@
           <w:p>
             <w:pPr>
               <w:pStyle w:val="Compact"/>
+              <w:jc w:val="left"/>
             </w:pPr>
             <w:r>
               <w:t xml:space="preserve">One deployable; module discipline enforced by convention and separate DbContexts</w:t>
@@ -3798,6 +4066,7 @@
           <w:p>
             <w:pPr>
               <w:pStyle w:val="Compact"/>
+              <w:jc w:val="left"/>
             </w:pPr>
             <w:r>
               <w:t xml:space="preserve">D2</w:t>
@@ -3809,6 +4078,7 @@
           <w:p>
             <w:pPr>
               <w:pStyle w:val="Compact"/>
+              <w:jc w:val="left"/>
             </w:pPr>
             <w:r>
               <w:t xml:space="preserve">SQL Server incl. embeddings</w:t>
@@ -3820,6 +4090,7 @@
           <w:p>
             <w:pPr>
               <w:pStyle w:val="Compact"/>
+              <w:jc w:val="left"/>
             </w:pPr>
             <w:r>
               <w:t xml:space="preserve">Vectors as</w:t>
@@ -3860,6 +4131,7 @@
           <w:p>
             <w:pPr>
               <w:pStyle w:val="Compact"/>
+              <w:jc w:val="left"/>
             </w:pPr>
             <w:r>
               <w:t xml:space="preserve">D3</w:t>
@@ -3871,6 +4143,7 @@
           <w:p>
             <w:pPr>
               <w:pStyle w:val="Compact"/>
+              <w:jc w:val="left"/>
             </w:pPr>
             <w:r>
               <w:rPr>
@@ -3891,6 +4164,7 @@
           <w:p>
             <w:pPr>
               <w:pStyle w:val="Compact"/>
+              <w:jc w:val="left"/>
             </w:pPr>
             <w:r>
               <w:t xml:space="preserve">Provider is configuration; SK optional later</w:t>
@@ -3904,6 +4178,7 @@
           <w:p>
             <w:pPr>
               <w:pStyle w:val="Compact"/>
+              <w:jc w:val="left"/>
             </w:pPr>
             <w:r>
               <w:t xml:space="preserve">D4</w:t>
@@ -3915,6 +4190,7 @@
           <w:p>
             <w:pPr>
               <w:pStyle w:val="Compact"/>
+              <w:jc w:val="left"/>
             </w:pPr>
             <w:r>
               <w:t xml:space="preserve">Ollama + Qwen 2.5</w:t>
@@ -3926,6 +4202,7 @@
           <w:p>
             <w:pPr>
               <w:pStyle w:val="Compact"/>
+              <w:jc w:val="left"/>
             </w:pPr>
             <w:r>
               <w:t xml:space="preserve">Fully private; quality risk R1 mitigated by evals</w:t>
@@ -3939,6 +4216,7 @@
           <w:p>
             <w:pPr>
               <w:pStyle w:val="Compact"/>
+              <w:jc w:val="left"/>
             </w:pPr>
             <w:r>
               <w:t xml:space="preserve">D5</w:t>
@@ -3950,6 +4228,7 @@
           <w:p>
             <w:pPr>
               <w:pStyle w:val="Compact"/>
+              <w:jc w:val="left"/>
             </w:pPr>
             <w:r>
               <w:t xml:space="preserve">Tesseract before vision LLM</w:t>
@@ -3961,6 +4240,7 @@
           <w:p>
             <w:pPr>
               <w:pStyle w:val="Compact"/>
+              <w:jc w:val="left"/>
             </w:pPr>
             <w:r>
               <w:t xml:space="preserve">Cheap deterministic OCR; LLM structures text</w:t>
@@ -3974,6 +4254,7 @@
           <w:p>
             <w:pPr>
               <w:pStyle w:val="Compact"/>
+              <w:jc w:val="left"/>
             </w:pPr>
             <w:r>
               <w:t xml:space="preserve">D6</w:t>
@@ -3985,6 +4266,7 @@
           <w:p>
             <w:pPr>
               <w:pStyle w:val="Compact"/>
+              <w:jc w:val="left"/>
             </w:pPr>
             <w:r>
               <w:t xml:space="preserve">Angular 20 signals, standalone</w:t>
@@ -3996,6 +4278,7 @@
           <w:p>
             <w:pPr>
               <w:pStyle w:val="Compact"/>
+              <w:jc w:val="left"/>
             </w:pPr>
             <w:r>
               <w:t xml:space="preserve">Modern Angular; contrast with reference repo</w:t>
@@ -4009,6 +4292,7 @@
           <w:p>
             <w:pPr>
               <w:pStyle w:val="Compact"/>
+              <w:jc w:val="left"/>
             </w:pPr>
             <w:r>
               <w:t xml:space="preserve">D7</w:t>
@@ -4020,6 +4304,7 @@
           <w:p>
             <w:pPr>
               <w:pStyle w:val="Compact"/>
+              <w:jc w:val="left"/>
             </w:pPr>
             <w:r>
               <w:t xml:space="preserve">Flutter + Riverpod + go_router + Drift</w:t>
@@ -4031,6 +4316,7 @@
           <w:p>
             <w:pPr>
               <w:pStyle w:val="Compact"/>
+              <w:jc w:val="left"/>
             </w:pPr>
             <w:r>
               <w:t xml:space="preserve">Offline-first mobile</w:t>
@@ -4044,6 +4330,7 @@
           <w:p>
             <w:pPr>
               <w:pStyle w:val="Compact"/>
+              <w:jc w:val="left"/>
             </w:pPr>
             <w:r>
               <w:t xml:space="preserve">D8</w:t>
@@ -4055,6 +4342,7 @@
           <w:p>
             <w:pPr>
               <w:pStyle w:val="Compact"/>
+              <w:jc w:val="left"/>
             </w:pPr>
             <w:r>
               <w:t xml:space="preserve">Markdown → Pandoc</w:t>
@@ -4075,6 +4363,7 @@
           <w:p>
             <w:pPr>
               <w:pStyle w:val="Compact"/>
+              <w:jc w:val="left"/>
             </w:pPr>
             <w:r>
               <w:t xml:space="preserve">Regenerable documents (this pipeline)</w:t>
@@ -4088,6 +4377,7 @@
           <w:p>
             <w:pPr>
               <w:pStyle w:val="Compact"/>
+              <w:jc w:val="left"/>
             </w:pPr>
             <w:r>
               <w:t xml:space="preserve">D9</w:t>
@@ -4099,6 +4389,7 @@
           <w:p>
             <w:pPr>
               <w:pStyle w:val="Compact"/>
+              <w:jc w:val="left"/>
             </w:pPr>
             <w:r>
               <w:t xml:space="preserve">Local git until Phase 9</w:t>
@@ -4110,6 +4401,7 @@
           <w:p>
             <w:pPr>
               <w:pStyle w:val="Compact"/>
+              <w:jc w:val="left"/>
             </w:pPr>
             <w:r>
               <w:t xml:space="preserve">Publish after privacy features exist</w:t>
@@ -4123,6 +4415,7 @@
           <w:p>
             <w:pPr>
               <w:pStyle w:val="Compact"/>
+              <w:jc w:val="left"/>
             </w:pPr>
             <w:r>
               <w:t xml:space="preserve">D10</w:t>
@@ -4134,6 +4427,7 @@
           <w:p>
             <w:pPr>
               <w:pStyle w:val="Compact"/>
+              <w:jc w:val="left"/>
             </w:pPr>
             <w:r>
               <w:t xml:space="preserve">One</w:t>
@@ -4160,6 +4454,7 @@
           <w:p>
             <w:pPr>
               <w:pStyle w:val="Compact"/>
+              <w:jc w:val="left"/>
             </w:pPr>
             <w:r>
               <w:t xml:space="preserve">Differs from the reference backend’s single shared context; migrations per module</w:t>
@@ -4168,8 +4463,8 @@
         </w:tc>
       </w:tr>
     </w:tbl>
-    <w:bookmarkEnd w:id="37"/>
-    <w:bookmarkStart w:id="38" w:name="open-points"/>
+    <w:bookmarkEnd w:id="48"/>
+    <w:bookmarkStart w:id="49" w:name="open-points"/>
     <w:p>
       <w:pPr>
         <w:pStyle w:val="Heading1"/>
@@ -4180,11 +4475,11 @@
     </w:p>
     <w:p>
       <w:pPr>
-        <w:pStyle w:val="Compact"/>
         <w:numPr>
           <w:ilvl w:val="0"/>
           <w:numId w:val="1002"/>
         </w:numPr>
+        <w:pStyle w:val="Compact"/>
       </w:pPr>
       <w:r>
         <w:t xml:space="preserve">Embedding storage:</w:t>
@@ -4222,17 +4517,17 @@
     </w:p>
     <w:p>
       <w:pPr>
-        <w:pStyle w:val="Compact"/>
         <w:numPr>
           <w:ilvl w:val="0"/>
           <w:numId w:val="1002"/>
         </w:numPr>
+        <w:pStyle w:val="Compact"/>
       </w:pPr>
       <w:r>
         <w:t xml:space="preserve">Push provider for iOS without a paid Apple developer account — decide in Phase 6.</w:t>
       </w:r>
     </w:p>
-    <w:bookmarkEnd w:id="38"/>
+    <w:bookmarkEnd w:id="49"/>
     <w:sectPr>
       <w:footnotePr>
         <w:numRestart w:val="eachSect"/>
@@ -4268,14 +4563,14 @@
 <file path=word/numbering.xml><?xml version="1.0" encoding="utf-8"?>
 <w:numbering xmlns:w="http://schemas.openxmlformats.org/wordprocessingml/2006/main">
   <w:abstractNum w:abstractNumId="990">
-    <w:nsid w:val="0000A990"/>
+    <w:nsid w:val="A990"/>
     <w:multiLevelType w:val="multilevel"/>
     <w:lvl w:ilvl="0">
       <w:numFmt w:val="bullet"/>
       <w:lvlText w:val=" "/>
       <w:lvlJc w:val="left"/>
       <w:pPr>
-        <w:ind w:left="720" w:hanging="360"/>
+        <w:ind w:left="720" w:hanging="480"/>
       </w:pPr>
     </w:lvl>
     <w:lvl w:ilvl="1">
@@ -4283,7 +4578,7 @@
       <w:lvlText w:val=" "/>
       <w:lvlJc w:val="left"/>
       <w:pPr>
-        <w:ind w:left="1440" w:hanging="360"/>
+        <w:ind w:left="1440" w:hanging="480"/>
       </w:pPr>
     </w:lvl>
     <w:lvl w:ilvl="2">
@@ -4291,7 +4586,7 @@
       <w:lvlText w:val=" "/>
       <w:lvlJc w:val="left"/>
       <w:pPr>
-        <w:ind w:left="2160" w:hanging="360"/>
+        <w:ind w:left="2160" w:hanging="480"/>
       </w:pPr>
     </w:lvl>
     <w:lvl w:ilvl="3">
@@ -4299,7 +4594,7 @@
       <w:lvlText w:val=" "/>
       <w:lvlJc w:val="left"/>
       <w:pPr>
-        <w:ind w:left="2880" w:hanging="360"/>
+        <w:ind w:left="2880" w:hanging="480"/>
       </w:pPr>
     </w:lvl>
     <w:lvl w:ilvl="4">
@@ -4307,7 +4602,7 @@
       <w:lvlText w:val=" "/>
       <w:lvlJc w:val="left"/>
       <w:pPr>
-        <w:ind w:left="3600" w:hanging="360"/>
+        <w:ind w:left="3600" w:hanging="480"/>
       </w:pPr>
     </w:lvl>
     <w:lvl w:ilvl="5">
@@ -4315,7 +4610,7 @@
       <w:lvlText w:val=" "/>
       <w:lvlJc w:val="left"/>
       <w:pPr>
-        <w:ind w:left="4320" w:hanging="360"/>
+        <w:ind w:left="4320" w:hanging="480"/>
       </w:pPr>
     </w:lvl>
     <w:lvl w:ilvl="6">
@@ -4323,7 +4618,7 @@
       <w:lvlText w:val=" "/>
       <w:lvlJc w:val="left"/>
       <w:pPr>
-        <w:ind w:left="5040" w:hanging="360"/>
+        <w:ind w:left="5040" w:hanging="480"/>
       </w:pPr>
     </w:lvl>
     <w:lvl w:ilvl="7">
@@ -4331,7 +4626,7 @@
       <w:lvlText w:val=" "/>
       <w:lvlJc w:val="left"/>
       <w:pPr>
-        <w:ind w:left="5760" w:hanging="360"/>
+        <w:ind w:left="5760" w:hanging="480"/>
       </w:pPr>
     </w:lvl>
     <w:lvl w:ilvl="8">
@@ -4339,12 +4634,12 @@
       <w:lvlText w:val=" "/>
       <w:lvlJc w:val="left"/>
       <w:pPr>
-        <w:ind w:left="6480" w:hanging="360"/>
+        <w:ind w:left="6480" w:hanging="480"/>
       </w:pPr>
     </w:lvl>
   </w:abstractNum>
   <w:abstractNum w:abstractNumId="99411">
-    <w:nsid w:val="00A99411"/>
+    <w:nsid w:val="A99411"/>
     <w:multiLevelType w:val="multilevel"/>
     <w:lvl w:ilvl="0">
       <w:start w:val="1"/>
@@ -4352,7 +4647,7 @@
       <w:lvlText w:val="%1."/>
       <w:lvlJc w:val="left"/>
       <w:pPr>
-        <w:ind w:left="720" w:hanging="360"/>
+        <w:ind w:left="720" w:hanging="480"/>
       </w:pPr>
     </w:lvl>
     <w:lvl w:ilvl="1">
@@ -4361,7 +4656,7 @@
       <w:lvlText w:val="%2."/>
       <w:lvlJc w:val="left"/>
       <w:pPr>
-        <w:ind w:left="1440" w:hanging="360"/>
+        <w:ind w:left="1440" w:hanging="480"/>
       </w:pPr>
     </w:lvl>
     <w:lvl w:ilvl="2">
@@ -4370,7 +4665,7 @@
       <w:lvlText w:val="%3."/>
       <w:lvlJc w:val="left"/>
       <w:pPr>
-        <w:ind w:left="2160" w:hanging="360"/>
+        <w:ind w:left="2160" w:hanging="480"/>
       </w:pPr>
     </w:lvl>
     <w:lvl w:ilvl="3">
@@ -4379,7 +4674,7 @@
       <w:lvlText w:val="%4."/>
       <w:lvlJc w:val="left"/>
       <w:pPr>
-        <w:ind w:left="2880" w:hanging="360"/>
+        <w:ind w:left="2880" w:hanging="480"/>
       </w:pPr>
     </w:lvl>
     <w:lvl w:ilvl="4">
@@ -4388,7 +4683,7 @@
       <w:lvlText w:val="%5."/>
       <w:lvlJc w:val="left"/>
       <w:pPr>
-        <w:ind w:left="3600" w:hanging="360"/>
+        <w:ind w:left="3600" w:hanging="480"/>
       </w:pPr>
     </w:lvl>
     <w:lvl w:ilvl="5">
@@ -4397,7 +4692,7 @@
       <w:lvlText w:val="%6."/>
       <w:lvlJc w:val="left"/>
       <w:pPr>
-        <w:ind w:left="4320" w:hanging="360"/>
+        <w:ind w:left="4320" w:hanging="480"/>
       </w:pPr>
     </w:lvl>
     <w:lvl w:ilvl="6">
@@ -4406,7 +4701,7 @@
       <w:lvlText w:val="%7."/>
       <w:lvlJc w:val="left"/>
       <w:pPr>
-        <w:ind w:left="5040" w:hanging="360"/>
+        <w:ind w:left="5040" w:hanging="480"/>
       </w:pPr>
     </w:lvl>
     <w:lvl w:ilvl="7">
@@ -4415,7 +4710,7 @@
       <w:lvlText w:val="%8."/>
       <w:lvlJc w:val="left"/>
       <w:pPr>
-        <w:ind w:left="5760" w:hanging="360"/>
+        <w:ind w:left="5760" w:hanging="480"/>
       </w:pPr>
     </w:lvl>
     <w:lvl w:ilvl="8">
@@ -4424,111 +4719,84 @@
       <w:lvlText w:val="%9."/>
       <w:lvlJc w:val="left"/>
       <w:pPr>
-        <w:ind w:left="6480" w:hanging="360"/>
+        <w:ind w:left="6480" w:hanging="480"/>
       </w:pPr>
     </w:lvl>
   </w:abstractNum>
   <w:abstractNum w:abstractNumId="991">
-    <w:nsid w:val="0000A991"/>
+    <w:nsid w:val="A991"/>
     <w:multiLevelType w:val="multilevel"/>
     <w:lvl w:ilvl="0">
       <w:numFmt w:val="bullet"/>
-      <w:lvlText w:val=""/>
+      <w:lvlText w:val="•"/>
       <w:lvlJc w:val="left"/>
       <w:pPr>
-        <w:ind w:left="720" w:hanging="360"/>
-      </w:pPr>
-      <w:rPr>
-        <w:rFonts w:ascii="Symbol" w:hAnsi="Symbol" w:cs="Symbol" w:hint="default"/>
-      </w:rPr>
+        <w:ind w:left="720" w:hanging="480"/>
+      </w:pPr>
     </w:lvl>
     <w:lvl w:ilvl="1">
       <w:numFmt w:val="bullet"/>
-      <w:lvlText w:val="o"/>
+      <w:lvlText w:val="–"/>
       <w:lvlJc w:val="left"/>
       <w:pPr>
-        <w:ind w:left="1440" w:hanging="360"/>
-      </w:pPr>
-      <w:rPr>
-        <w:rFonts w:ascii="Courier New" w:hAnsi="Courier New" w:cs="Courier New" w:hint="default"/>
-      </w:rPr>
+        <w:ind w:left="1440" w:hanging="480"/>
+      </w:pPr>
     </w:lvl>
     <w:lvl w:ilvl="2">
       <w:numFmt w:val="bullet"/>
-      <w:lvlText w:val=""/>
+      <w:lvlText w:val="•"/>
       <w:lvlJc w:val="left"/>
       <w:pPr>
-        <w:ind w:left="2160" w:hanging="360"/>
-      </w:pPr>
-      <w:rPr>
-        <w:rFonts w:ascii="Wingdings" w:hAnsi="Wingdings" w:cs="Wingdings" w:hint="default"/>
-      </w:rPr>
+        <w:ind w:left="2160" w:hanging="480"/>
+      </w:pPr>
     </w:lvl>
     <w:lvl w:ilvl="3">
       <w:numFmt w:val="bullet"/>
-      <w:lvlText w:val=""/>
+      <w:lvlText w:val="–"/>
       <w:lvlJc w:val="left"/>
       <w:pPr>
-        <w:ind w:left="2880" w:hanging="360"/>
-      </w:pPr>
-      <w:rPr>
-        <w:rFonts w:ascii="Symbol" w:hAnsi="Symbol" w:cs="Symbol" w:hint="default"/>
-      </w:rPr>
+        <w:ind w:left="2880" w:hanging="480"/>
+      </w:pPr>
     </w:lvl>
     <w:lvl w:ilvl="4">
       <w:numFmt w:val="bullet"/>
-      <w:lvlText w:val="o"/>
+      <w:lvlText w:val="•"/>
       <w:lvlJc w:val="left"/>
       <w:pPr>
-        <w:ind w:left="3600" w:hanging="360"/>
-      </w:pPr>
-      <w:rPr>
-        <w:rFonts w:ascii="Courier New" w:hAnsi="Courier New" w:cs="Courier New" w:hint="default"/>
-      </w:rPr>
+        <w:ind w:left="3600" w:hanging="480"/>
+      </w:pPr>
     </w:lvl>
     <w:lvl w:ilvl="5">
       <w:numFmt w:val="bullet"/>
-      <w:lvlText w:val=""/>
+      <w:lvlText w:val="–"/>
       <w:lvlJc w:val="left"/>
       <w:pPr>
-        <w:ind w:left="4320" w:hanging="360"/>
-      </w:pPr>
-      <w:rPr>
-        <w:rFonts w:ascii="Wingdings" w:hAnsi="Wingdings" w:cs="Wingdings" w:hint="default"/>
-      </w:rPr>
+        <w:ind w:left="4320" w:hanging="480"/>
+      </w:pPr>
     </w:lvl>
     <w:lvl w:ilvl="6">
       <w:numFmt w:val="bullet"/>
-      <w:lvlText w:val=""/>
+      <w:lvlText w:val="•"/>
       <w:lvlJc w:val="left"/>
       <w:pPr>
-        <w:ind w:left="5040" w:hanging="360"/>
-      </w:pPr>
-      <w:rPr>
-        <w:rFonts w:ascii="Symbol" w:hAnsi="Symbol" w:cs="Symbol" w:hint="default"/>
-      </w:rPr>
+        <w:ind w:left="5040" w:hanging="480"/>
+      </w:pPr>
     </w:lvl>
     <w:lvl w:ilvl="7">
       <w:numFmt w:val="bullet"/>
-      <w:lvlText w:val="o"/>
+      <w:lvlText w:val="–"/>
       <w:lvlJc w:val="left"/>
       <w:pPr>
-        <w:ind w:left="5760" w:hanging="360"/>
-      </w:pPr>
-      <w:rPr>
-        <w:rFonts w:ascii="Courier New" w:hAnsi="Courier New" w:cs="Courier New" w:hint="default"/>
-      </w:rPr>
+        <w:ind w:left="5760" w:hanging="480"/>
+      </w:pPr>
     </w:lvl>
     <w:lvl w:ilvl="8">
       <w:numFmt w:val="bullet"/>
-      <w:lvlText w:val=""/>
+      <w:lvlText w:val="•"/>
       <w:lvlJc w:val="left"/>
       <w:pPr>
-        <w:ind w:left="6480" w:hanging="360"/>
-      </w:pPr>
-      <w:rPr>
-        <w:rFonts w:ascii="Wingdings" w:hAnsi="Wingdings" w:cs="Wingdings" w:hint="default"/>
-      </w:rPr>
+        <w:ind w:left="6480" w:hanging="480"/>
+      </w:pPr>
     </w:lvl>
   </w:abstractNum>
   <w:num w:numId="1000">
@@ -5283,8 +5551,8 @@
     <w:name w:val="KeywordTok"/>
     <w:basedOn w:val="VerbatimChar"/>
     <w:rPr>
+      <w:color w:val="007020"/>
       <w:b/>
-      <w:color w:val="007020"/>
     </w:rPr>
   </w:style>
   <w:style w:type="character" w:customStyle="1" w:styleId="DataTypeTok">
@@ -5361,42 +5629,42 @@
     <w:name w:val="ImportTok"/>
     <w:basedOn w:val="VerbatimChar"/>
     <w:rPr>
+      <w:color w:val="008000"/>
       <w:b/>
-      <w:color w:val="008000"/>
     </w:rPr>
   </w:style>
   <w:style w:type="character" w:customStyle="1" w:styleId="CommentTok">
     <w:name w:val="CommentTok"/>
     <w:basedOn w:val="VerbatimChar"/>
     <w:rPr>
+      <w:color w:val="60a0b0"/>
       <w:i/>
-      <w:color w:val="60a0b0"/>
     </w:rPr>
   </w:style>
   <w:style w:type="character" w:customStyle="1" w:styleId="DocumentationTok">
     <w:name w:val="DocumentationTok"/>
     <w:basedOn w:val="VerbatimChar"/>
     <w:rPr>
+      <w:color w:val="ba2121"/>
       <w:i/>
-      <w:color w:val="ba2121"/>
     </w:rPr>
   </w:style>
   <w:style w:type="character" w:customStyle="1" w:styleId="AnnotationTok">
     <w:name w:val="AnnotationTok"/>
     <w:basedOn w:val="VerbatimChar"/>
     <w:rPr>
+      <w:color w:val="60a0b0"/>
       <w:b/>
       <w:i/>
-      <w:color w:val="60a0b0"/>
     </w:rPr>
   </w:style>
   <w:style w:type="character" w:customStyle="1" w:styleId="CommentVarTok">
     <w:name w:val="CommentVarTok"/>
     <w:basedOn w:val="VerbatimChar"/>
     <w:rPr>
+      <w:color w:val="60a0b0"/>
       <w:b/>
       <w:i/>
-      <w:color w:val="60a0b0"/>
     </w:rPr>
   </w:style>
   <w:style w:type="character" w:customStyle="1" w:styleId="OtherTok">
@@ -5424,8 +5692,8 @@
     <w:name w:val="ControlFlowTok"/>
     <w:basedOn w:val="VerbatimChar"/>
     <w:rPr>
+      <w:color w:val="007020"/>
       <w:b/>
-      <w:color w:val="007020"/>
     </w:rPr>
   </w:style>
   <w:style w:type="character" w:customStyle="1" w:styleId="OperatorTok">
@@ -5470,34 +5738,34 @@
     <w:name w:val="InformationTok"/>
     <w:basedOn w:val="VerbatimChar"/>
     <w:rPr>
+      <w:color w:val="60a0b0"/>
       <w:b/>
       <w:i/>
-      <w:color w:val="60a0b0"/>
     </w:rPr>
   </w:style>
   <w:style w:type="character" w:customStyle="1" w:styleId="WarningTok">
     <w:name w:val="WarningTok"/>
     <w:basedOn w:val="VerbatimChar"/>
     <w:rPr>
+      <w:color w:val="60a0b0"/>
       <w:b/>
       <w:i/>
-      <w:color w:val="60a0b0"/>
     </w:rPr>
   </w:style>
   <w:style w:type="character" w:customStyle="1" w:styleId="AlertTok">
     <w:name w:val="AlertTok"/>
     <w:basedOn w:val="VerbatimChar"/>
     <w:rPr>
+      <w:color w:val="ff0000"/>
       <w:b/>
-      <w:color w:val="ff0000"/>
     </w:rPr>
   </w:style>
   <w:style w:type="character" w:customStyle="1" w:styleId="ErrorTok">
     <w:name w:val="ErrorTok"/>
     <w:basedOn w:val="VerbatimChar"/>
     <w:rPr>
+      <w:color w:val="ff0000"/>
       <w:b/>
-      <w:color w:val="ff0000"/>
     </w:rPr>
   </w:style>
   <w:style w:type="character" w:customStyle="1" w:styleId="NormalTok">

</xml_diff>

<commit_message>
step(4.9): formalize the e2e happy path and close the Phase 4 docs loop
Learned: e2e suites as repositories of browser truths, unique-per-run test data, automate-cheap document-environmental, docs as an API feedback channel, honest user documentation

Co-Authored-By: Claude Fable 5 <noreply@anthropic.com>
Claude-Session: https://claude.ai/code/session_01XCaaD2oSfQhWv3vNENZDue
</commit_message>
<xml_diff>
--- a/docs/deliverables/out/Architecture.docx
+++ b/docs/deliverables/out/Architecture.docx
@@ -229,6 +229,56 @@
             </w:pPr>
             <w:r>
               <w:t xml:space="preserve">C4 context + container, module map, key flows, decisions D1–D9 (roadmap step 0.5)</w:t>
+            </w:r>
+          </w:p>
+        </w:tc>
+      </w:tr>
+      <w:tr>
+        <w:tc>
+          <w:tcPr/>
+          <w:p>
+            <w:pPr>
+              <w:pStyle w:val="Compact"/>
+              <w:jc w:val="left"/>
+            </w:pPr>
+            <w:r>
+              <w:t xml:space="preserve">0.2</w:t>
+            </w:r>
+          </w:p>
+        </w:tc>
+        <w:tc>
+          <w:tcPr/>
+          <w:p>
+            <w:pPr>
+              <w:pStyle w:val="Compact"/>
+              <w:jc w:val="left"/>
+            </w:pPr>
+            <w:r>
+              <w:t xml:space="preserve">2026-08-30</w:t>
+            </w:r>
+          </w:p>
+        </w:tc>
+        <w:tc>
+          <w:tcPr/>
+          <w:p>
+            <w:pPr>
+              <w:pStyle w:val="Compact"/>
+              <w:jc w:val="left"/>
+            </w:pPr>
+            <w:r>
+              <w:t xml:space="preserve">Abdulsalam</w:t>
+            </w:r>
+          </w:p>
+        </w:tc>
+        <w:tc>
+          <w:tcPr/>
+          <w:p>
+            <w:pPr>
+              <w:pStyle w:val="Compact"/>
+              <w:jc w:val="left"/>
+            </w:pPr>
+            <w:r>
+              <w:t xml:space="preserve">§Frontend architecture (as built, Phase 4): workspace map, boundaries, auth+XSRF flow, data access, i18n/RTL, zoneless; API-shape observation from 4.7 (roadmap step 4.9)</w:t>
             </w:r>
           </w:p>
         </w:tc>
@@ -3451,7 +3501,7 @@
     </w:p>
     <w:bookmarkEnd w:id="45"/>
     <w:bookmarkEnd w:id="46"/>
-    <w:bookmarkStart w:id="47" w:name="cross-cutting-concerns"/>
+    <w:bookmarkStart w:id="52" w:name="frontend-architecture-as-built-phase-4"/>
     <w:p>
       <w:pPr>
         <w:pStyle w:val="Heading1"/>
@@ -3466,7 +3516,127 @@
         <w:tab/>
       </w:r>
       <w:r>
-        <w:t xml:space="preserve">Cross-cutting concerns</w:t>
+        <w:t xml:space="preserve">Frontend architecture (as built, Phase 4)</w:t>
+      </w:r>
+    </w:p>
+    <w:p>
+      <w:pPr>
+        <w:pStyle w:val="FirstParagraph"/>
+      </w:pPr>
+      <w:r>
+        <w:t xml:space="preserve">The portal is an Nx 21 workspace (</w:t>
+      </w:r>
+      <w:r>
+        <w:rPr>
+          <w:rStyle w:val="VerbatimChar"/>
+        </w:rPr>
+        <w:t xml:space="preserve">frontend/</w:t>
+      </w:r>
+      <w:r>
+        <w:t xml:space="preserve">), Angular 20,</w:t>
+      </w:r>
+      <w:r>
+        <w:t xml:space="preserve"> </w:t>
+      </w:r>
+      <w:r>
+        <w:rPr>
+          <w:bCs/>
+          <w:b/>
+        </w:rPr>
+        <w:t xml:space="preserve">zoneless</w:t>
+      </w:r>
+      <w:r>
+        <w:t xml:space="preserve"> </w:t>
+      </w:r>
+      <w:r>
+        <w:t xml:space="preserve">(</w:t>
+      </w:r>
+      <w:r>
+        <w:rPr>
+          <w:rStyle w:val="VerbatimChar"/>
+        </w:rPr>
+        <w:t xml:space="preserve">provideZonelessChangeDetection</w:t>
+      </w:r>
+      <w:r>
+        <w:t xml:space="preserve">;</w:t>
+      </w:r>
+      <w:r>
+        <w:t xml:space="preserve"> </w:t>
+      </w:r>
+      <w:r>
+        <w:t xml:space="preserve">zone.js is not installed) — all view state lives in signals, derivation in</w:t>
+      </w:r>
+      <w:r>
+        <w:t xml:space="preserve"> </w:t>
+      </w:r>
+      <w:r>
+        <w:rPr>
+          <w:rStyle w:val="VerbatimChar"/>
+        </w:rPr>
+        <w:t xml:space="preserve">computed</w:t>
+      </w:r>
+      <w:r>
+        <w:t xml:space="preserve">, with exactly</w:t>
+      </w:r>
+      <w:r>
+        <w:t xml:space="preserve"> </w:t>
+      </w:r>
+      <w:r>
+        <w:t xml:space="preserve">two sanctioned</w:t>
+      </w:r>
+      <w:r>
+        <w:t xml:space="preserve"> </w:t>
+      </w:r>
+      <w:r>
+        <w:rPr>
+          <w:rStyle w:val="VerbatimChar"/>
+        </w:rPr>
+        <w:t xml:space="preserve">effect</w:t>
+      </w:r>
+      <w:r>
+        <w:t xml:space="preserve"> </w:t>
+      </w:r>
+      <w:r>
+        <w:t xml:space="preserve">shapes: syncing state OUT of Angular (the i18n</w:t>
+      </w:r>
+      <w:r>
+        <w:t xml:space="preserve"> </w:t>
+      </w:r>
+      <w:r>
+        <w:rPr>
+          <w:rStyle w:val="VerbatimChar"/>
+        </w:rPr>
+        <w:t xml:space="preserve">&lt;html dir/lang&gt;</w:t>
+      </w:r>
+      <w:r>
+        <w:t xml:space="preserve"> </w:t>
+      </w:r>
+      <w:r>
+        <w:t xml:space="preserve">writer) and</w:t>
+      </w:r>
+      <w:r>
+        <w:t xml:space="preserve"> </w:t>
+      </w:r>
+      <w:r>
+        <w:t xml:space="preserve">the guarded seed-once INTO editable state (the reminder-rule editor).</w:t>
+      </w:r>
+    </w:p>
+    <w:bookmarkStart w:id="47" w:name="workspace-map-and-boundaries"/>
+    <w:p>
+      <w:pPr>
+        <w:pStyle w:val="Heading2"/>
+      </w:pPr>
+      <w:r>
+        <w:rPr>
+          <w:rStyle w:val="SectionNumber"/>
+        </w:rPr>
+        <w:t xml:space="preserve">6.1</w:t>
+      </w:r>
+      <w:r>
+        <w:tab/>
+      </w:r>
+      <w:r>
+        <w:t xml:space="preserve">Workspace map and boundaries</w:t>
       </w:r>
     </w:p>
     <w:tbl>
@@ -3493,124 +3663,36 @@
               <w:jc w:val="left"/>
             </w:pPr>
             <w:r>
-              <w:t xml:space="preserve">Concern</w:t>
-            </w:r>
-          </w:p>
-        </w:tc>
-        <w:tc>
-          <w:tcPr/>
-          <w:p>
-            <w:pPr>
-              <w:pStyle w:val="Compact"/>
-              <w:jc w:val="left"/>
-            </w:pPr>
-            <w:r>
-              <w:t xml:space="preserve">Approach</w:t>
-            </w:r>
-          </w:p>
-        </w:tc>
-        <w:tc>
-          <w:tcPr/>
-          <w:p>
-            <w:pPr>
-              <w:pStyle w:val="Compact"/>
-              <w:jc w:val="left"/>
-            </w:pPr>
-            <w:r>
-              <w:t xml:space="preserve">Status</w:t>
+              <w:t xml:space="preserve">Project</w:t>
+            </w:r>
+          </w:p>
+        </w:tc>
+        <w:tc>
+          <w:tcPr/>
+          <w:p>
+            <w:pPr>
+              <w:pStyle w:val="Compact"/>
+              <w:jc w:val="left"/>
+            </w:pPr>
+            <w:r>
+              <w:t xml:space="preserve">Tag</w:t>
+            </w:r>
+          </w:p>
+        </w:tc>
+        <w:tc>
+          <w:tcPr/>
+          <w:p>
+            <w:pPr>
+              <w:pStyle w:val="Compact"/>
+              <w:jc w:val="left"/>
+            </w:pPr>
+            <w:r>
+              <w:t xml:space="preserve">Role</w:t>
             </w:r>
           </w:p>
         </w:tc>
       </w:tr>
       <w:tr>
-        <w:tc>
-          <w:tcPr/>
-          <w:p>
-            <w:pPr>
-              <w:pStyle w:val="Compact"/>
-              <w:jc w:val="left"/>
-            </w:pPr>
-            <w:r>
-              <w:t xml:space="preserve">Authentication</w:t>
-            </w:r>
-          </w:p>
-        </w:tc>
-        <w:tc>
-          <w:tcPr/>
-          <w:p>
-            <w:pPr>
-              <w:pStyle w:val="Compact"/>
-              <w:jc w:val="left"/>
-            </w:pPr>
-            <w:r>
-              <w:t xml:space="preserve">OpenIddict (ABP), OIDC code flow for web, password/refresh for mobile</w:t>
-            </w:r>
-          </w:p>
-        </w:tc>
-        <w:tc>
-          <w:tcPr/>
-          <w:p>
-            <w:pPr>
-              <w:pStyle w:val="Compact"/>
-              <w:jc w:val="left"/>
-            </w:pPr>
-            <w:r>
-              <w:t xml:space="preserve">Planned (P1)</w:t>
-            </w:r>
-          </w:p>
-        </w:tc>
-      </w:tr>
-      <w:tr>
-        <w:tc>
-          <w:tcPr/>
-          <w:p>
-            <w:pPr>
-              <w:pStyle w:val="Compact"/>
-              <w:jc w:val="left"/>
-            </w:pPr>
-            <w:r>
-              <w:t xml:space="preserve">Authorization</w:t>
-            </w:r>
-          </w:p>
-        </w:tc>
-        <w:tc>
-          <w:tcPr/>
-          <w:p>
-            <w:pPr>
-              <w:pStyle w:val="Compact"/>
-              <w:jc w:val="left"/>
-            </w:pPr>
-            <w:r>
-              <w:t xml:space="preserve">ABP permissions per module; data filtered by owner user id</w:t>
-            </w:r>
-          </w:p>
-        </w:tc>
-        <w:tc>
-          <w:tcPr/>
-          <w:p>
-            <w:pPr>
-              <w:pStyle w:val="Compact"/>
-              <w:jc w:val="left"/>
-            </w:pPr>
-            <w:r>
-              <w:t xml:space="preserve">Planned (P1)</w:t>
-            </w:r>
-          </w:p>
-        </w:tc>
-      </w:tr>
-      <w:tr>
-        <w:tc>
-          <w:tcPr/>
-          <w:p>
-            <w:pPr>
-              <w:pStyle w:val="Compact"/>
-              <w:jc w:val="left"/>
-            </w:pPr>
-            <w:r>
-              <w:t xml:space="preserve">Privacy routing</w:t>
-            </w:r>
-          </w:p>
-        </w:tc>
         <w:tc>
           <w:tcPr/>
           <w:p>
@@ -3622,82 +3704,51 @@
               <w:rPr>
                 <w:rStyle w:val="VerbatimChar"/>
               </w:rPr>
-              <w:t xml:space="preserve">Ai</w:t>
-            </w:r>
-            <w:r>
-              <w:t xml:space="preserve"> </w:t>
-            </w:r>
-            <w:r>
-              <w:t xml:space="preserve">chooses provider per</w:t>
-            </w:r>
-            <w:r>
-              <w:t xml:space="preserve"> </w:t>
-            </w:r>
-            <w:r>
-              <w:rPr>
-                <w:iCs/>
-                <w:i/>
-              </w:rPr>
-              <w:t xml:space="preserve">purpose</w:t>
-            </w:r>
-            <w:r>
-              <w:t xml:space="preserve">:</w:t>
-            </w:r>
-            <w:r>
-              <w:t xml:space="preserve"> </w:t>
-            </w:r>
+              <w:t xml:space="preserve">apps/wathiq_portal</w:t>
+            </w:r>
+          </w:p>
+        </w:tc>
+        <w:tc>
+          <w:tcPr/>
+          <w:p>
+            <w:pPr>
+              <w:pStyle w:val="Compact"/>
+              <w:jc w:val="left"/>
+            </w:pPr>
             <w:r>
               <w:rPr>
                 <w:rStyle w:val="VerbatimChar"/>
               </w:rPr>
-              <w:t xml:space="preserve">Extraction</w:t>
-            </w:r>
-            <w:r>
-              <w:t xml:space="preserve"> </w:t>
-            </w:r>
-            <w:r>
-              <w:t xml:space="preserve">→ local only;</w:t>
-            </w:r>
-            <w:r>
-              <w:t xml:space="preserve"> </w:t>
-            </w:r>
+              <w:t xml:space="preserve">type:app, scope:portal</w:t>
+            </w:r>
+          </w:p>
+        </w:tc>
+        <w:tc>
+          <w:tcPr/>
+          <w:p>
+            <w:pPr>
+              <w:pStyle w:val="Compact"/>
+              <w:jc w:val="left"/>
+            </w:pPr>
+            <w:r>
+              <w:t xml:space="preserve">shell, routing, providers</w:t>
+            </w:r>
+          </w:p>
+        </w:tc>
+      </w:tr>
+      <w:tr>
+        <w:tc>
+          <w:tcPr/>
+          <w:p>
+            <w:pPr>
+              <w:pStyle w:val="Compact"/>
+              <w:jc w:val="left"/>
+            </w:pPr>
             <w:r>
               <w:rPr>
                 <w:rStyle w:val="VerbatimChar"/>
               </w:rPr>
-              <w:t xml:space="preserve">GuideChat</w:t>
-            </w:r>
-            <w:r>
-              <w:t xml:space="preserve"> </w:t>
-            </w:r>
-            <w:r>
-              <w:t xml:space="preserve">→ local or cloud by config</w:t>
-            </w:r>
-          </w:p>
-        </w:tc>
-        <w:tc>
-          <w:tcPr/>
-          <w:p>
-            <w:pPr>
-              <w:pStyle w:val="Compact"/>
-              <w:jc w:val="left"/>
-            </w:pPr>
-            <w:r>
-              <w:t xml:space="preserve">Planned (P3)</w:t>
-            </w:r>
-          </w:p>
-        </w:tc>
-      </w:tr>
-      <w:tr>
-        <w:tc>
-          <w:tcPr/>
-          <w:p>
-            <w:pPr>
-              <w:pStyle w:val="Compact"/>
-              <w:jc w:val="left"/>
-            </w:pPr>
-            <w:r>
-              <w:t xml:space="preserve">Usage caps</w:t>
+              <w:t xml:space="preserve">apps/wathiq_portal_e2e</w:t>
             </w:r>
           </w:p>
         </w:tc>
@@ -3712,25 +3763,19 @@
               <w:rPr>
                 <w:rStyle w:val="VerbatimChar"/>
               </w:rPr>
-              <w:t xml:space="preserve">ai.Usage</w:t>
-            </w:r>
-            <w:r>
-              <w:t xml:space="preserve"> </w:t>
-            </w:r>
-            <w:r>
-              <w:t xml:space="preserve">row per call; per-user daily count checked before each call</w:t>
-            </w:r>
-          </w:p>
-        </w:tc>
-        <w:tc>
-          <w:tcPr/>
-          <w:p>
-            <w:pPr>
-              <w:pStyle w:val="Compact"/>
-              <w:jc w:val="left"/>
-            </w:pPr>
-            <w:r>
-              <w:t xml:space="preserve">Planned (P3)</w:t>
+              <w:t xml:space="preserve">type:e2e</w:t>
+            </w:r>
+          </w:p>
+        </w:tc>
+        <w:tc>
+          <w:tcPr/>
+          <w:p>
+            <w:pPr>
+              <w:pStyle w:val="Compact"/>
+              <w:jc w:val="left"/>
+            </w:pPr>
+            <w:r>
+              <w:t xml:space="preserve">Playwright happy path against the live stack</w:t>
             </w:r>
           </w:p>
         </w:tc>
@@ -3743,67 +3788,43 @@
               <w:pStyle w:val="Compact"/>
               <w:jc w:val="left"/>
             </w:pPr>
-            <w:r>
-              <w:t xml:space="preserve">Localization</w:t>
-            </w:r>
-          </w:p>
-        </w:tc>
-        <w:tc>
-          <w:tcPr/>
-          <w:p>
-            <w:pPr>
-              <w:pStyle w:val="Compact"/>
-              <w:jc w:val="left"/>
-            </w:pPr>
-            <w:r>
-              <w:t xml:space="preserve">ABP localization JSON (ar, en); clients carry their own</w:t>
-            </w:r>
-            <w:r>
-              <w:t xml:space="preserve"> </w:t>
-            </w:r>
             <w:r>
               <w:rPr>
                 <w:rStyle w:val="VerbatimChar"/>
               </w:rPr>
-              <w:t xml:space="preserve">ar.json</w:t>
-            </w:r>
-            <w:r>
-              <w:t xml:space="preserve">/</w:t>
-            </w:r>
+              <w:t xml:space="preserve">libs/documents</w:t>
+            </w:r>
+          </w:p>
+        </w:tc>
+        <w:tc>
+          <w:tcPr/>
+          <w:p>
+            <w:pPr>
+              <w:pStyle w:val="Compact"/>
+              <w:jc w:val="left"/>
+            </w:pPr>
             <w:r>
               <w:rPr>
                 <w:rStyle w:val="VerbatimChar"/>
               </w:rPr>
-              <w:t xml:space="preserve">en.json</w:t>
-            </w:r>
-          </w:p>
-        </w:tc>
-        <w:tc>
-          <w:tcPr/>
-          <w:p>
-            <w:pPr>
-              <w:pStyle w:val="Compact"/>
-              <w:jc w:val="left"/>
-            </w:pPr>
-            <w:r>
-              <w:t xml:space="preserve">Planned (P1, P4)</w:t>
+              <w:t xml:space="preserve">type:feature</w:t>
+            </w:r>
+          </w:p>
+        </w:tc>
+        <w:tc>
+          <w:tcPr/>
+          <w:p>
+            <w:pPr>
+              <w:pStyle w:val="Compact"/>
+              <w:jc w:val="left"/>
+            </w:pPr>
+            <w:r>
+              <w:t xml:space="preserve">list/detail, add wizard, extraction review</w:t>
             </w:r>
           </w:p>
         </w:tc>
       </w:tr>
       <w:tr>
-        <w:tc>
-          <w:tcPr/>
-          <w:p>
-            <w:pPr>
-              <w:pStyle w:val="Compact"/>
-              <w:jc w:val="left"/>
-            </w:pPr>
-            <w:r>
-              <w:t xml:space="preserve">Files</w:t>
-            </w:r>
-          </w:p>
-        </w:tc>
         <w:tc>
           <w:tcPr/>
           <w:p>
@@ -3815,25 +3836,34 @@
               <w:rPr>
                 <w:rStyle w:val="VerbatimChar"/>
               </w:rPr>
-              <w:t xml:space="preserve">IFileStore</w:t>
-            </w:r>
-            <w:r>
-              <w:t xml:space="preserve"> </w:t>
-            </w:r>
-            <w:r>
-              <w:t xml:space="preserve">abstraction; local encrypted disk now, S3-compatible later</w:t>
-            </w:r>
-          </w:p>
-        </w:tc>
-        <w:tc>
-          <w:tcPr/>
-          <w:p>
-            <w:pPr>
-              <w:pStyle w:val="Compact"/>
-              <w:jc w:val="left"/>
-            </w:pPr>
-            <w:r>
-              <w:t xml:space="preserve">Planned (P1)</w:t>
+              <w:t xml:space="preserve">libs/reminders</w:t>
+            </w:r>
+          </w:p>
+        </w:tc>
+        <w:tc>
+          <w:tcPr/>
+          <w:p>
+            <w:pPr>
+              <w:pStyle w:val="Compact"/>
+              <w:jc w:val="left"/>
+            </w:pPr>
+            <w:r>
+              <w:rPr>
+                <w:rStyle w:val="VerbatimChar"/>
+              </w:rPr>
+              <w:t xml:space="preserve">type:feature</w:t>
+            </w:r>
+          </w:p>
+        </w:tc>
+        <w:tc>
+          <w:tcPr/>
+          <w:p>
+            <w:pPr>
+              <w:pStyle w:val="Compact"/>
+              <w:jc w:val="left"/>
+            </w:pPr>
+            <w:r>
+              <w:t xml:space="preserve">expiry timeline, rule editor</w:t>
             </w:r>
           </w:p>
         </w:tc>
@@ -3847,31 +3877,61 @@
               <w:jc w:val="left"/>
             </w:pPr>
             <w:r>
-              <w:t xml:space="preserve">Observability</w:t>
-            </w:r>
-          </w:p>
-        </w:tc>
-        <w:tc>
-          <w:tcPr/>
-          <w:p>
-            <w:pPr>
-              <w:pStyle w:val="Compact"/>
-              <w:jc w:val="left"/>
-            </w:pPr>
-            <w:r>
-              <w:t xml:space="preserve">Serilog → Seq; health checks; Hangfire dashboard (admin only)</w:t>
-            </w:r>
-          </w:p>
-        </w:tc>
-        <w:tc>
-          <w:tcPr/>
-          <w:p>
-            <w:pPr>
-              <w:pStyle w:val="Compact"/>
-              <w:jc w:val="left"/>
-            </w:pPr>
-            <w:r>
-              <w:t xml:space="preserve">Planned (P7)</w:t>
+              <w:rPr>
+                <w:rStyle w:val="VerbatimChar"/>
+              </w:rPr>
+              <w:t xml:space="preserve">libs/shared/api</w:t>
+            </w:r>
+          </w:p>
+        </w:tc>
+        <w:tc>
+          <w:tcPr/>
+          <w:p>
+            <w:pPr>
+              <w:pStyle w:val="Compact"/>
+              <w:jc w:val="left"/>
+            </w:pPr>
+            <w:r>
+              <w:rPr>
+                <w:rStyle w:val="VerbatimChar"/>
+              </w:rPr>
+              <w:t xml:space="preserve">scope:shared</w:t>
+            </w:r>
+          </w:p>
+        </w:tc>
+        <w:tc>
+          <w:tcPr/>
+          <w:p>
+            <w:pPr>
+              <w:pStyle w:val="Compact"/>
+              <w:jc w:val="left"/>
+            </w:pPr>
+            <w:r>
+              <w:t xml:space="preserve">committed</w:t>
+            </w:r>
+            <w:r>
+              <w:t xml:space="preserve"> </w:t>
+            </w:r>
+            <w:r>
+              <w:rPr>
+                <w:rStyle w:val="VerbatimChar"/>
+              </w:rPr>
+              <w:t xml:space="preserve">swagger.json</w:t>
+            </w:r>
+            <w:r>
+              <w:t xml:space="preserve"> </w:t>
+            </w:r>
+            <w:r>
+              <w:t xml:space="preserve">+ generated types (</w:t>
+            </w:r>
+            <w:r>
+              <w:rPr>
+                <w:rStyle w:val="VerbatimChar"/>
+              </w:rPr>
+              <w:t xml:space="preserve">npm run generate:api</w:t>
+            </w:r>
+            <w:r>
+              <w:t xml:space="preserve">), base-URL token, dev proxy conventions</w:t>
             </w:r>
           </w:p>
         </w:tc>
@@ -3885,53 +3945,126 @@
               <w:jc w:val="left"/>
             </w:pPr>
             <w:r>
-              <w:t xml:space="preserve">Deployment</w:t>
-            </w:r>
-          </w:p>
-        </w:tc>
-        <w:tc>
-          <w:tcPr/>
-          <w:p>
-            <w:pPr>
-              <w:pStyle w:val="Compact"/>
-              <w:jc w:val="left"/>
-            </w:pPr>
-            <w:r>
-              <w:t xml:space="preserve">Docker Compose: api, sql, ollama; volumes for data/files/models</w:t>
-            </w:r>
-          </w:p>
-        </w:tc>
-        <w:tc>
-          <w:tcPr/>
-          <w:p>
-            <w:pPr>
-              <w:pStyle w:val="Compact"/>
-              <w:jc w:val="left"/>
-            </w:pPr>
-            <w:r>
-              <w:t xml:space="preserve">Planned (P0.6 skeleton, P7)</w:t>
+              <w:rPr>
+                <w:rStyle w:val="VerbatimChar"/>
+              </w:rPr>
+              <w:t xml:space="preserve">libs/shared/auth</w:t>
+            </w:r>
+          </w:p>
+        </w:tc>
+        <w:tc>
+          <w:tcPr/>
+          <w:p>
+            <w:pPr>
+              <w:pStyle w:val="Compact"/>
+              <w:jc w:val="left"/>
+            </w:pPr>
+            <w:r>
+              <w:rPr>
+                <w:rStyle w:val="VerbatimChar"/>
+              </w:rPr>
+              <w:t xml:space="preserve">scope:shared</w:t>
+            </w:r>
+          </w:p>
+        </w:tc>
+        <w:tc>
+          <w:tcPr/>
+          <w:p>
+            <w:pPr>
+              <w:pStyle w:val="Compact"/>
+              <w:jc w:val="left"/>
+            </w:pPr>
+            <w:r>
+              <w:t xml:space="preserve">OIDC code+PKCE facade (signals), auth + XSRF interceptors, guard</w:t>
+            </w:r>
+          </w:p>
+        </w:tc>
+      </w:tr>
+      <w:tr>
+        <w:tc>
+          <w:tcPr/>
+          <w:p>
+            <w:pPr>
+              <w:pStyle w:val="Compact"/>
+              <w:jc w:val="left"/>
+            </w:pPr>
+            <w:r>
+              <w:rPr>
+                <w:rStyle w:val="VerbatimChar"/>
+              </w:rPr>
+              <w:t xml:space="preserve">libs/shared/i18n</w:t>
+            </w:r>
+          </w:p>
+        </w:tc>
+        <w:tc>
+          <w:tcPr/>
+          <w:p>
+            <w:pPr>
+              <w:pStyle w:val="Compact"/>
+              <w:jc w:val="left"/>
+            </w:pPr>
+            <w:r>
+              <w:rPr>
+                <w:rStyle w:val="VerbatimChar"/>
+              </w:rPr>
+              <w:t xml:space="preserve">scope:shared</w:t>
+            </w:r>
+          </w:p>
+        </w:tc>
+        <w:tc>
+          <w:tcPr/>
+          <w:p>
+            <w:pPr>
+              <w:pStyle w:val="Compact"/>
+              <w:jc w:val="left"/>
+            </w:pPr>
+            <w:r>
+              <w:t xml:space="preserve">Transloco (ar-first), language signal → dir/locale, locale data</w:t>
             </w:r>
           </w:p>
         </w:tc>
       </w:tr>
     </w:tbl>
+    <w:p>
+      <w:pPr>
+        <w:pStyle w:val="BodyText"/>
+      </w:pPr>
+      <w:r>
+        <w:rPr>
+          <w:rStyle w:val="VerbatimChar"/>
+        </w:rPr>
+        <w:t xml:space="preserve">@nx/enforce-module-boundaries</w:t>
+      </w:r>
+      <w:r>
+        <w:t xml:space="preserve"> </w:t>
+      </w:r>
+      <w:r>
+        <w:t xml:space="preserve">enforces: app → feature/shared; feature → shared; shared → shared —</w:t>
+      </w:r>
+      <w:r>
+        <w:t xml:space="preserve"> </w:t>
+      </w:r>
+      <w:r>
+        <w:t xml:space="preserve">the frontend twin of ADR-001, declared before the first lib existed.</w:t>
+      </w:r>
+    </w:p>
     <w:bookmarkEnd w:id="47"/>
-    <w:bookmarkStart w:id="48" w:name="decisions-log"/>
+    <w:bookmarkStart w:id="48" w:name="auth-flow-as-built"/>
     <w:p>
       <w:pPr>
-        <w:pStyle w:val="Heading1"/>
+        <w:pStyle w:val="Heading2"/>
       </w:pPr>
       <w:r>
         <w:rPr>
           <w:rStyle w:val="SectionNumber"/>
         </w:rPr>
-        <w:t xml:space="preserve">7</w:t>
+        <w:t xml:space="preserve">6.2</w:t>
       </w:r>
       <w:r>
         <w:tab/>
       </w:r>
       <w:r>
-        <w:t xml:space="preserve">Decisions log</w:t>
+        <w:t xml:space="preserve">Auth flow (as built)</w:t>
       </w:r>
     </w:p>
     <w:p>
@@ -3939,34 +4072,464 @@
         <w:pStyle w:val="FirstParagraph"/>
       </w:pPr>
       <w:r>
-        <w:t xml:space="preserve">D1–D9 are from</w:t>
-      </w:r>
-      <w:r>
-        <w:t xml:space="preserve"> </w:t>
-      </w:r>
-      <w:r>
-        <w:rPr>
-          <w:rStyle w:val="VerbatimChar"/>
-        </w:rPr>
-        <w:t xml:space="preserve">docs/PLAN.md</w:t>
-      </w:r>
-      <w:r>
-        <w:t xml:space="preserve"> </w:t>
-      </w:r>
-      <w:r>
-        <w:t xml:space="preserve">§6 and are summarised here; D10 onward are recorded as ADRs in</w:t>
-      </w:r>
-      <w:r>
-        <w:t xml:space="preserve"> </w:t>
-      </w:r>
-      <w:r>
-        <w:rPr>
-          <w:rStyle w:val="VerbatimChar"/>
-        </w:rPr>
-        <w:t xml:space="preserve">docs/decisions/</w:t>
-      </w:r>
-      <w:r>
-        <w:t xml:space="preserve">.</w:t>
+        <w:t xml:space="preserve">Authorization code + PKCE against the host’s OpenIddict (</w:t>
+      </w:r>
+      <w:r>
+        <w:rPr>
+          <w:rStyle w:val="VerbatimChar"/>
+        </w:rPr>
+        <w:t xml:space="preserve">Wathiq_App</w:t>
+      </w:r>
+      <w:r>
+        <w:t xml:space="preserve">, public client, no secret).</w:t>
+      </w:r>
+      <w:r>
+        <w:t xml:space="preserve"> </w:t>
+      </w:r>
+      <w:r>
+        <w:t xml:space="preserve">An app initializer completes the</w:t>
+      </w:r>
+      <w:r>
+        <w:t xml:space="preserve"> </w:t>
+      </w:r>
+      <w:r>
+        <w:rPr>
+          <w:rStyle w:val="VerbatimChar"/>
+        </w:rPr>
+        <w:t xml:space="preserve">?code=</w:t>
+      </w:r>
+      <w:r>
+        <w:t xml:space="preserve"> </w:t>
+      </w:r>
+      <w:r>
+        <w:t xml:space="preserve">exchange before any guard runs; auth state is one signal</w:t>
+      </w:r>
+      <w:r>
+        <w:t xml:space="preserve"> </w:t>
+      </w:r>
+      <w:r>
+        <w:t xml:space="preserve">derived from the OAuth library’s events. Two interceptors: bearer-on-API-URLs, and the ABP</w:t>
+      </w:r>
+      <w:r>
+        <w:t xml:space="preserve"> </w:t>
+      </w:r>
+      <w:r>
+        <w:t xml:space="preserve">antiforgery pair — the login cookie rides proxied API calls (cookies ignore ports), so the client</w:t>
+      </w:r>
+      <w:r>
+        <w:t xml:space="preserve"> </w:t>
+      </w:r>
+      <w:r>
+        <w:t xml:space="preserve">returns the</w:t>
+      </w:r>
+      <w:r>
+        <w:t xml:space="preserve"> </w:t>
+      </w:r>
+      <w:r>
+        <w:rPr>
+          <w:rStyle w:val="VerbatimChar"/>
+        </w:rPr>
+        <w:t xml:space="preserve">XSRF-TOKEN</w:t>
+      </w:r>
+      <w:r>
+        <w:t xml:space="preserve"> </w:t>
+      </w:r>
+      <w:r>
+        <w:t xml:space="preserve">cookie as</w:t>
+      </w:r>
+      <w:r>
+        <w:t xml:space="preserve"> </w:t>
+      </w:r>
+      <w:r>
+        <w:rPr>
+          <w:rStyle w:val="VerbatimChar"/>
+        </w:rPr>
+        <w:t xml:space="preserve">RequestVerificationToken</w:t>
+      </w:r>
+      <w:r>
+        <w:t xml:space="preserve"> </w:t>
+      </w:r>
+      <w:r>
+        <w:t xml:space="preserve">and re-fetches</w:t>
+      </w:r>
+      <w:r>
+        <w:t xml:space="preserve"> </w:t>
+      </w:r>
+      <w:r>
+        <w:rPr>
+          <w:rStyle w:val="VerbatimChar"/>
+        </w:rPr>
+        <w:t xml:space="preserve">/api/abp/application-configuration</w:t>
+      </w:r>
+      <w:r>
+        <w:t xml:space="preserve"> </w:t>
+      </w:r>
+      <w:r>
+        <w:t xml:space="preserve">post-login to get a token bound to the signed-in principal.</w:t>
+      </w:r>
+    </w:p>
+    <w:bookmarkEnd w:id="48"/>
+    <w:bookmarkStart w:id="49" w:name="data-access"/>
+    <w:p>
+      <w:pPr>
+        <w:pStyle w:val="Heading2"/>
+      </w:pPr>
+      <w:r>
+        <w:rPr>
+          <w:rStyle w:val="SectionNumber"/>
+        </w:rPr>
+        <w:t xml:space="preserve">6.3</w:t>
+      </w:r>
+      <w:r>
+        <w:tab/>
+      </w:r>
+      <w:r>
+        <w:t xml:space="preserve">Data access</w:t>
+      </w:r>
+    </w:p>
+    <w:p>
+      <w:pPr>
+        <w:pStyle w:val="FirstParagraph"/>
+      </w:pPr>
+      <w:r>
+        <w:t xml:space="preserve">Relative</w:t>
+      </w:r>
+      <w:r>
+        <w:t xml:space="preserve"> </w:t>
+      </w:r>
+      <w:r>
+        <w:rPr>
+          <w:rStyle w:val="VerbatimChar"/>
+        </w:rPr>
+        <w:t xml:space="preserve">/api/*</w:t>
+      </w:r>
+      <w:r>
+        <w:t xml:space="preserve"> </w:t>
+      </w:r>
+      <w:r>
+        <w:t xml:space="preserve">URLs through the dev proxy (deployment supplies a base URL via injection token);</w:t>
+      </w:r>
+      <w:r>
+        <w:t xml:space="preserve"> </w:t>
+      </w:r>
+      <w:r>
+        <w:t xml:space="preserve">reads are</w:t>
+      </w:r>
+      <w:r>
+        <w:t xml:space="preserve"> </w:t>
+      </w:r>
+      <w:r>
+        <w:rPr>
+          <w:rStyle w:val="VerbatimChar"/>
+        </w:rPr>
+        <w:t xml:space="preserve">httpResource</w:t>
+      </w:r>
+      <w:r>
+        <w:t xml:space="preserve"> </w:t>
+      </w:r>
+      <w:r>
+        <w:t xml:space="preserve">with reactive URLs (pagination = writing a page signal), writes are plain</w:t>
+      </w:r>
+      <w:r>
+        <w:t xml:space="preserve"> </w:t>
+      </w:r>
+      <w:r>
+        <w:rPr>
+          <w:rStyle w:val="VerbatimChar"/>
+        </w:rPr>
+        <w:t xml:space="preserve">HttpClient</w:t>
+      </w:r>
+      <w:r>
+        <w:t xml:space="preserve"> </w:t>
+      </w:r>
+      <w:r>
+        <w:t xml:space="preserve">posts that end by reloading the owning resource. DTO types are generated from the</w:t>
+      </w:r>
+      <w:r>
+        <w:t xml:space="preserve"> </w:t>
+      </w:r>
+      <w:r>
+        <w:t xml:space="preserve">committed</w:t>
+      </w:r>
+      <w:r>
+        <w:t xml:space="preserve"> </w:t>
+      </w:r>
+      <w:r>
+        <w:rPr>
+          <w:rStyle w:val="VerbatimChar"/>
+        </w:rPr>
+        <w:t xml:space="preserve">swagger.json</w:t>
+      </w:r>
+      <w:r>
+        <w:t xml:space="preserve">; regeneration turns backend contract drift into a compile error and a diff.</w:t>
+      </w:r>
+    </w:p>
+    <w:bookmarkEnd w:id="49"/>
+    <w:bookmarkStart w:id="50" w:name="i18n-rtl"/>
+    <w:p>
+      <w:pPr>
+        <w:pStyle w:val="Heading2"/>
+      </w:pPr>
+      <w:r>
+        <w:rPr>
+          <w:rStyle w:val="SectionNumber"/>
+        </w:rPr>
+        <w:t xml:space="preserve">6.4</w:t>
+      </w:r>
+      <w:r>
+        <w:tab/>
+      </w:r>
+      <w:r>
+        <w:t xml:space="preserve">i18n / RTL</w:t>
+      </w:r>
+    </w:p>
+    <w:p>
+      <w:pPr>
+        <w:pStyle w:val="FirstParagraph"/>
+      </w:pPr>
+      <w:r>
+        <w:t xml:space="preserve">Arabic-first: one</w:t>
+      </w:r>
+      <w:r>
+        <w:t xml:space="preserve"> </w:t>
+      </w:r>
+      <w:r>
+        <w:rPr>
+          <w:rStyle w:val="VerbatimChar"/>
+        </w:rPr>
+        <w:t xml:space="preserve">lang</w:t>
+      </w:r>
+      <w:r>
+        <w:t xml:space="preserve"> </w:t>
+      </w:r>
+      <w:r>
+        <w:t xml:space="preserve">signal;</w:t>
+      </w:r>
+      <w:r>
+        <w:t xml:space="preserve"> </w:t>
+      </w:r>
+      <w:r>
+        <w:rPr>
+          <w:rStyle w:val="VerbatimChar"/>
+        </w:rPr>
+        <w:t xml:space="preserve">dir</w:t>
+      </w:r>
+      <w:r>
+        <w:t xml:space="preserve">, locale and Transloco’s active language derive from it.</w:t>
+      </w:r>
+      <w:r>
+        <w:t xml:space="preserve"> </w:t>
+      </w:r>
+      <w:r>
+        <w:t xml:space="preserve">Spatial CSS is logical-properties-only (</w:t>
+      </w:r>
+      <w:r>
+        <w:rPr>
+          <w:rStyle w:val="VerbatimChar"/>
+        </w:rPr>
+        <w:t xml:space="preserve">ms-</w:t>
+      </w:r>
+      <w:r>
+        <w:t xml:space="preserve">/</w:t>
+      </w:r>
+      <w:r>
+        <w:rPr>
+          <w:rStyle w:val="VerbatimChar"/>
+        </w:rPr>
+        <w:t xml:space="preserve">me-</w:t>
+      </w:r>
+      <w:r>
+        <w:t xml:space="preserve">/</w:t>
+      </w:r>
+      <w:r>
+        <w:rPr>
+          <w:rStyle w:val="VerbatimChar"/>
+        </w:rPr>
+        <w:t xml:space="preserve">text-start</w:t>
+      </w:r>
+      <w:r>
+        <w:t xml:space="preserve">), so the</w:t>
+      </w:r>
+      <w:r>
+        <w:t xml:space="preserve"> </w:t>
+      </w:r>
+      <w:r>
+        <w:rPr>
+          <w:rStyle w:val="VerbatimChar"/>
+        </w:rPr>
+        <w:t xml:space="preserve">dir</w:t>
+      </w:r>
+      <w:r>
+        <w:t xml:space="preserve"> </w:t>
+      </w:r>
+      <w:r>
+        <w:t xml:space="preserve">flip mirrors the</w:t>
+      </w:r>
+      <w:r>
+        <w:t xml:space="preserve"> </w:t>
+      </w:r>
+      <w:r>
+        <w:t xml:space="preserve">whole app; dates/numbers pass</w:t>
+      </w:r>
+      <w:r>
+        <w:t xml:space="preserve"> </w:t>
+      </w:r>
+      <w:r>
+        <w:rPr>
+          <w:rStyle w:val="VerbatimChar"/>
+        </w:rPr>
+        <w:t xml:space="preserve">locale()</w:t>
+      </w:r>
+      <w:r>
+        <w:t xml:space="preserve"> </w:t>
+      </w:r>
+      <w:r>
+        <w:t xml:space="preserve">as a pipe argument. Every screen ships</w:t>
+      </w:r>
+      <w:r>
+        <w:t xml:space="preserve"> </w:t>
+      </w:r>
+      <w:r>
+        <w:rPr>
+          <w:rStyle w:val="VerbatimChar"/>
+        </w:rPr>
+        <w:t xml:space="preserve">ar</w:t>
+      </w:r>
+      <w:r>
+        <w:t xml:space="preserve">+</w:t>
+      </w:r>
+      <w:r>
+        <w:rPr>
+          <w:rStyle w:val="VerbatimChar"/>
+        </w:rPr>
+        <w:t xml:space="preserve">en</w:t>
+      </w:r>
+      <w:r>
+        <w:t xml:space="preserve"> </w:t>
+      </w:r>
+      <w:r>
+        <w:t xml:space="preserve">keys in</w:t>
+      </w:r>
+      <w:r>
+        <w:t xml:space="preserve"> </w:t>
+      </w:r>
+      <w:r>
+        <w:t xml:space="preserve">its own commit.</w:t>
+      </w:r>
+    </w:p>
+    <w:bookmarkEnd w:id="50"/>
+    <w:bookmarkStart w:id="51" w:name="X74d2491138b4130552519899f37b739516d50c9"/>
+    <w:p>
+      <w:pPr>
+        <w:pStyle w:val="Heading2"/>
+      </w:pPr>
+      <w:r>
+        <w:rPr>
+          <w:rStyle w:val="SectionNumber"/>
+        </w:rPr>
+        <w:t xml:space="preserve">6.5</w:t>
+      </w:r>
+      <w:r>
+        <w:tab/>
+      </w:r>
+      <w:r>
+        <w:t xml:space="preserve">API-shape observations (feedback to the backend)</w:t>
+      </w:r>
+    </w:p>
+    <w:p>
+      <w:pPr>
+        <w:numPr>
+          <w:ilvl w:val="0"/>
+          <w:numId w:val="1002"/>
+        </w:numPr>
+        <w:pStyle w:val="Compact"/>
+      </w:pPr>
+      <w:r>
+        <w:rPr>
+          <w:iCs/>
+          <w:i/>
+        </w:rPr>
+        <w:t xml:space="preserve">(4.7)</w:t>
+      </w:r>
+      <w:r>
+        <w:t xml:space="preserve"> </w:t>
+      </w:r>
+      <w:r>
+        <w:t xml:space="preserve">OCR readiness is only observable by attempting extraction (</w:t>
+      </w:r>
+      <w:r>
+        <w:rPr>
+          <w:rStyle w:val="VerbatimChar"/>
+        </w:rPr>
+        <w:t xml:space="preserve">ExtractionNotReady</w:t>
+      </w:r>
+      <w:r>
+        <w:t xml:space="preserve">); the</w:t>
+      </w:r>
+      <w:r>
+        <w:t xml:space="preserve"> </w:t>
+      </w:r>
+      <w:r>
+        <w:t xml:space="preserve">review UI polls by retrying visibly. A lightweight status (a field on</w:t>
+      </w:r>
+      <w:r>
+        <w:t xml:space="preserve"> </w:t>
+      </w:r>
+      <w:r>
+        <w:rPr>
+          <w:rStyle w:val="VerbatimChar"/>
+        </w:rPr>
+        <w:t xml:space="preserve">AttachmentDto</w:t>
+      </w:r>
+      <w:r>
+        <w:t xml:space="preserve"> </w:t>
+      </w:r>
+      <w:r>
+        <w:t xml:space="preserve">or a</w:t>
+      </w:r>
+      <w:r>
+        <w:t xml:space="preserve"> </w:t>
+      </w:r>
+      <w:r>
+        <w:t xml:space="preserve">dedicated endpoint) would let the UI show</w:t>
+      </w:r>
+      <w:r>
+        <w:t xml:space="preserve"> </w:t>
+      </w:r>
+      <w:r>
+        <w:t xml:space="preserve">“</w:t>
+      </w:r>
+      <w:r>
+        <w:t xml:space="preserve">reading…</w:t>
+      </w:r>
+      <w:r>
+        <w:t xml:space="preserve">”</w:t>
+      </w:r>
+      <w:r>
+        <w:t xml:space="preserve"> </w:t>
+      </w:r>
+      <w:r>
+        <w:t xml:space="preserve">before the first attempt.</w:t>
+      </w:r>
+    </w:p>
+    <w:bookmarkEnd w:id="51"/>
+    <w:bookmarkEnd w:id="52"/>
+    <w:bookmarkStart w:id="53" w:name="cross-cutting-concerns"/>
+    <w:p>
+      <w:pPr>
+        <w:pStyle w:val="Heading1"/>
+      </w:pPr>
+      <w:r>
+        <w:rPr>
+          <w:rStyle w:val="SectionNumber"/>
+        </w:rPr>
+        <w:t xml:space="preserve">7</w:t>
+      </w:r>
+      <w:r>
+        <w:tab/>
+      </w:r>
+      <w:r>
+        <w:t xml:space="preserve">Cross-cutting concerns</w:t>
       </w:r>
     </w:p>
     <w:tbl>
@@ -3993,6 +4556,506 @@
               <w:jc w:val="left"/>
             </w:pPr>
             <w:r>
+              <w:t xml:space="preserve">Concern</w:t>
+            </w:r>
+          </w:p>
+        </w:tc>
+        <w:tc>
+          <w:tcPr/>
+          <w:p>
+            <w:pPr>
+              <w:pStyle w:val="Compact"/>
+              <w:jc w:val="left"/>
+            </w:pPr>
+            <w:r>
+              <w:t xml:space="preserve">Approach</w:t>
+            </w:r>
+          </w:p>
+        </w:tc>
+        <w:tc>
+          <w:tcPr/>
+          <w:p>
+            <w:pPr>
+              <w:pStyle w:val="Compact"/>
+              <w:jc w:val="left"/>
+            </w:pPr>
+            <w:r>
+              <w:t xml:space="preserve">Status</w:t>
+            </w:r>
+          </w:p>
+        </w:tc>
+      </w:tr>
+      <w:tr>
+        <w:tc>
+          <w:tcPr/>
+          <w:p>
+            <w:pPr>
+              <w:pStyle w:val="Compact"/>
+              <w:jc w:val="left"/>
+            </w:pPr>
+            <w:r>
+              <w:t xml:space="preserve">Authentication</w:t>
+            </w:r>
+          </w:p>
+        </w:tc>
+        <w:tc>
+          <w:tcPr/>
+          <w:p>
+            <w:pPr>
+              <w:pStyle w:val="Compact"/>
+              <w:jc w:val="left"/>
+            </w:pPr>
+            <w:r>
+              <w:t xml:space="preserve">OpenIddict (ABP), OIDC code flow for web, password/refresh for mobile</w:t>
+            </w:r>
+          </w:p>
+        </w:tc>
+        <w:tc>
+          <w:tcPr/>
+          <w:p>
+            <w:pPr>
+              <w:pStyle w:val="Compact"/>
+              <w:jc w:val="left"/>
+            </w:pPr>
+            <w:r>
+              <w:t xml:space="preserve">Planned (P1)</w:t>
+            </w:r>
+          </w:p>
+        </w:tc>
+      </w:tr>
+      <w:tr>
+        <w:tc>
+          <w:tcPr/>
+          <w:p>
+            <w:pPr>
+              <w:pStyle w:val="Compact"/>
+              <w:jc w:val="left"/>
+            </w:pPr>
+            <w:r>
+              <w:t xml:space="preserve">Authorization</w:t>
+            </w:r>
+          </w:p>
+        </w:tc>
+        <w:tc>
+          <w:tcPr/>
+          <w:p>
+            <w:pPr>
+              <w:pStyle w:val="Compact"/>
+              <w:jc w:val="left"/>
+            </w:pPr>
+            <w:r>
+              <w:t xml:space="preserve">ABP permissions per module; data filtered by owner user id</w:t>
+            </w:r>
+          </w:p>
+        </w:tc>
+        <w:tc>
+          <w:tcPr/>
+          <w:p>
+            <w:pPr>
+              <w:pStyle w:val="Compact"/>
+              <w:jc w:val="left"/>
+            </w:pPr>
+            <w:r>
+              <w:t xml:space="preserve">Planned (P1)</w:t>
+            </w:r>
+          </w:p>
+        </w:tc>
+      </w:tr>
+      <w:tr>
+        <w:tc>
+          <w:tcPr/>
+          <w:p>
+            <w:pPr>
+              <w:pStyle w:val="Compact"/>
+              <w:jc w:val="left"/>
+            </w:pPr>
+            <w:r>
+              <w:t xml:space="preserve">Privacy routing</w:t>
+            </w:r>
+          </w:p>
+        </w:tc>
+        <w:tc>
+          <w:tcPr/>
+          <w:p>
+            <w:pPr>
+              <w:pStyle w:val="Compact"/>
+              <w:jc w:val="left"/>
+            </w:pPr>
+            <w:r>
+              <w:rPr>
+                <w:rStyle w:val="VerbatimChar"/>
+              </w:rPr>
+              <w:t xml:space="preserve">Ai</w:t>
+            </w:r>
+            <w:r>
+              <w:t xml:space="preserve"> </w:t>
+            </w:r>
+            <w:r>
+              <w:t xml:space="preserve">chooses provider per</w:t>
+            </w:r>
+            <w:r>
+              <w:t xml:space="preserve"> </w:t>
+            </w:r>
+            <w:r>
+              <w:rPr>
+                <w:iCs/>
+                <w:i/>
+              </w:rPr>
+              <w:t xml:space="preserve">purpose</w:t>
+            </w:r>
+            <w:r>
+              <w:t xml:space="preserve">:</w:t>
+            </w:r>
+            <w:r>
+              <w:t xml:space="preserve"> </w:t>
+            </w:r>
+            <w:r>
+              <w:rPr>
+                <w:rStyle w:val="VerbatimChar"/>
+              </w:rPr>
+              <w:t xml:space="preserve">Extraction</w:t>
+            </w:r>
+            <w:r>
+              <w:t xml:space="preserve"> </w:t>
+            </w:r>
+            <w:r>
+              <w:t xml:space="preserve">→ local only;</w:t>
+            </w:r>
+            <w:r>
+              <w:t xml:space="preserve"> </w:t>
+            </w:r>
+            <w:r>
+              <w:rPr>
+                <w:rStyle w:val="VerbatimChar"/>
+              </w:rPr>
+              <w:t xml:space="preserve">GuideChat</w:t>
+            </w:r>
+            <w:r>
+              <w:t xml:space="preserve"> </w:t>
+            </w:r>
+            <w:r>
+              <w:t xml:space="preserve">→ local or cloud by config</w:t>
+            </w:r>
+          </w:p>
+        </w:tc>
+        <w:tc>
+          <w:tcPr/>
+          <w:p>
+            <w:pPr>
+              <w:pStyle w:val="Compact"/>
+              <w:jc w:val="left"/>
+            </w:pPr>
+            <w:r>
+              <w:t xml:space="preserve">Planned (P3)</w:t>
+            </w:r>
+          </w:p>
+        </w:tc>
+      </w:tr>
+      <w:tr>
+        <w:tc>
+          <w:tcPr/>
+          <w:p>
+            <w:pPr>
+              <w:pStyle w:val="Compact"/>
+              <w:jc w:val="left"/>
+            </w:pPr>
+            <w:r>
+              <w:t xml:space="preserve">Usage caps</w:t>
+            </w:r>
+          </w:p>
+        </w:tc>
+        <w:tc>
+          <w:tcPr/>
+          <w:p>
+            <w:pPr>
+              <w:pStyle w:val="Compact"/>
+              <w:jc w:val="left"/>
+            </w:pPr>
+            <w:r>
+              <w:rPr>
+                <w:rStyle w:val="VerbatimChar"/>
+              </w:rPr>
+              <w:t xml:space="preserve">ai.Usage</w:t>
+            </w:r>
+            <w:r>
+              <w:t xml:space="preserve"> </w:t>
+            </w:r>
+            <w:r>
+              <w:t xml:space="preserve">row per call; per-user daily count checked before each call</w:t>
+            </w:r>
+          </w:p>
+        </w:tc>
+        <w:tc>
+          <w:tcPr/>
+          <w:p>
+            <w:pPr>
+              <w:pStyle w:val="Compact"/>
+              <w:jc w:val="left"/>
+            </w:pPr>
+            <w:r>
+              <w:t xml:space="preserve">Planned (P3)</w:t>
+            </w:r>
+          </w:p>
+        </w:tc>
+      </w:tr>
+      <w:tr>
+        <w:tc>
+          <w:tcPr/>
+          <w:p>
+            <w:pPr>
+              <w:pStyle w:val="Compact"/>
+              <w:jc w:val="left"/>
+            </w:pPr>
+            <w:r>
+              <w:t xml:space="preserve">Localization</w:t>
+            </w:r>
+          </w:p>
+        </w:tc>
+        <w:tc>
+          <w:tcPr/>
+          <w:p>
+            <w:pPr>
+              <w:pStyle w:val="Compact"/>
+              <w:jc w:val="left"/>
+            </w:pPr>
+            <w:r>
+              <w:t xml:space="preserve">ABP localization JSON (ar, en); clients carry their own</w:t>
+            </w:r>
+            <w:r>
+              <w:t xml:space="preserve"> </w:t>
+            </w:r>
+            <w:r>
+              <w:rPr>
+                <w:rStyle w:val="VerbatimChar"/>
+              </w:rPr>
+              <w:t xml:space="preserve">ar.json</w:t>
+            </w:r>
+            <w:r>
+              <w:t xml:space="preserve">/</w:t>
+            </w:r>
+            <w:r>
+              <w:rPr>
+                <w:rStyle w:val="VerbatimChar"/>
+              </w:rPr>
+              <w:t xml:space="preserve">en.json</w:t>
+            </w:r>
+          </w:p>
+        </w:tc>
+        <w:tc>
+          <w:tcPr/>
+          <w:p>
+            <w:pPr>
+              <w:pStyle w:val="Compact"/>
+              <w:jc w:val="left"/>
+            </w:pPr>
+            <w:r>
+              <w:t xml:space="preserve">Planned (P1, P4)</w:t>
+            </w:r>
+          </w:p>
+        </w:tc>
+      </w:tr>
+      <w:tr>
+        <w:tc>
+          <w:tcPr/>
+          <w:p>
+            <w:pPr>
+              <w:pStyle w:val="Compact"/>
+              <w:jc w:val="left"/>
+            </w:pPr>
+            <w:r>
+              <w:t xml:space="preserve">Files</w:t>
+            </w:r>
+          </w:p>
+        </w:tc>
+        <w:tc>
+          <w:tcPr/>
+          <w:p>
+            <w:pPr>
+              <w:pStyle w:val="Compact"/>
+              <w:jc w:val="left"/>
+            </w:pPr>
+            <w:r>
+              <w:rPr>
+                <w:rStyle w:val="VerbatimChar"/>
+              </w:rPr>
+              <w:t xml:space="preserve">IFileStore</w:t>
+            </w:r>
+            <w:r>
+              <w:t xml:space="preserve"> </w:t>
+            </w:r>
+            <w:r>
+              <w:t xml:space="preserve">abstraction; local encrypted disk now, S3-compatible later</w:t>
+            </w:r>
+          </w:p>
+        </w:tc>
+        <w:tc>
+          <w:tcPr/>
+          <w:p>
+            <w:pPr>
+              <w:pStyle w:val="Compact"/>
+              <w:jc w:val="left"/>
+            </w:pPr>
+            <w:r>
+              <w:t xml:space="preserve">Planned (P1)</w:t>
+            </w:r>
+          </w:p>
+        </w:tc>
+      </w:tr>
+      <w:tr>
+        <w:tc>
+          <w:tcPr/>
+          <w:p>
+            <w:pPr>
+              <w:pStyle w:val="Compact"/>
+              <w:jc w:val="left"/>
+            </w:pPr>
+            <w:r>
+              <w:t xml:space="preserve">Observability</w:t>
+            </w:r>
+          </w:p>
+        </w:tc>
+        <w:tc>
+          <w:tcPr/>
+          <w:p>
+            <w:pPr>
+              <w:pStyle w:val="Compact"/>
+              <w:jc w:val="left"/>
+            </w:pPr>
+            <w:r>
+              <w:t xml:space="preserve">Serilog → Seq; health checks; Hangfire dashboard (admin only)</w:t>
+            </w:r>
+          </w:p>
+        </w:tc>
+        <w:tc>
+          <w:tcPr/>
+          <w:p>
+            <w:pPr>
+              <w:pStyle w:val="Compact"/>
+              <w:jc w:val="left"/>
+            </w:pPr>
+            <w:r>
+              <w:t xml:space="preserve">Planned (P7)</w:t>
+            </w:r>
+          </w:p>
+        </w:tc>
+      </w:tr>
+      <w:tr>
+        <w:tc>
+          <w:tcPr/>
+          <w:p>
+            <w:pPr>
+              <w:pStyle w:val="Compact"/>
+              <w:jc w:val="left"/>
+            </w:pPr>
+            <w:r>
+              <w:t xml:space="preserve">Deployment</w:t>
+            </w:r>
+          </w:p>
+        </w:tc>
+        <w:tc>
+          <w:tcPr/>
+          <w:p>
+            <w:pPr>
+              <w:pStyle w:val="Compact"/>
+              <w:jc w:val="left"/>
+            </w:pPr>
+            <w:r>
+              <w:t xml:space="preserve">Docker Compose: api, sql, ollama; volumes for data/files/models</w:t>
+            </w:r>
+          </w:p>
+        </w:tc>
+        <w:tc>
+          <w:tcPr/>
+          <w:p>
+            <w:pPr>
+              <w:pStyle w:val="Compact"/>
+              <w:jc w:val="left"/>
+            </w:pPr>
+            <w:r>
+              <w:t xml:space="preserve">Planned (P0.6 skeleton, P7)</w:t>
+            </w:r>
+          </w:p>
+        </w:tc>
+      </w:tr>
+    </w:tbl>
+    <w:bookmarkEnd w:id="53"/>
+    <w:bookmarkStart w:id="54" w:name="decisions-log"/>
+    <w:p>
+      <w:pPr>
+        <w:pStyle w:val="Heading1"/>
+      </w:pPr>
+      <w:r>
+        <w:rPr>
+          <w:rStyle w:val="SectionNumber"/>
+        </w:rPr>
+        <w:t xml:space="preserve">8</w:t>
+      </w:r>
+      <w:r>
+        <w:tab/>
+      </w:r>
+      <w:r>
+        <w:t xml:space="preserve">Decisions log</w:t>
+      </w:r>
+    </w:p>
+    <w:p>
+      <w:pPr>
+        <w:pStyle w:val="FirstParagraph"/>
+      </w:pPr>
+      <w:r>
+        <w:t xml:space="preserve">D1–D9 are from</w:t>
+      </w:r>
+      <w:r>
+        <w:t xml:space="preserve"> </w:t>
+      </w:r>
+      <w:r>
+        <w:rPr>
+          <w:rStyle w:val="VerbatimChar"/>
+        </w:rPr>
+        <w:t xml:space="preserve">docs/PLAN.md</w:t>
+      </w:r>
+      <w:r>
+        <w:t xml:space="preserve"> </w:t>
+      </w:r>
+      <w:r>
+        <w:t xml:space="preserve">§6 and are summarised here; D10 onward are recorded as ADRs in</w:t>
+      </w:r>
+      <w:r>
+        <w:t xml:space="preserve"> </w:t>
+      </w:r>
+      <w:r>
+        <w:rPr>
+          <w:rStyle w:val="VerbatimChar"/>
+        </w:rPr>
+        <w:t xml:space="preserve">docs/decisions/</w:t>
+      </w:r>
+      <w:r>
+        <w:t xml:space="preserve">.</w:t>
+      </w:r>
+    </w:p>
+    <w:tbl>
+      <w:tblPr>
+        <w:tblStyle w:val="Table"/>
+        <w:tblW w:type="pct" w:w="5000"/>
+        <w:tblLook w:firstRow="1" w:lastRow="0" w:firstColumn="0" w:lastColumn="0" w:noHBand="0" w:noVBand="0" w:val="0020"/>
+        <w:jc w:val="start"/>
+      </w:tblPr>
+      <w:tblGrid>
+        <w:gridCol w:w="2640"/>
+        <w:gridCol w:w="2640"/>
+        <w:gridCol w:w="2640"/>
+      </w:tblGrid>
+      <w:tr>
+        <w:trPr>
+          <w:tblHeader w:val="true"/>
+        </w:trPr>
+        <w:tc>
+          <w:tcPr/>
+          <w:p>
+            <w:pPr>
+              <w:pStyle w:val="Compact"/>
+              <w:jc w:val="left"/>
+            </w:pPr>
+            <w:r>
               <w:t xml:space="preserve">ID</w:t>
             </w:r>
           </w:p>
@@ -4463,8 +5526,8 @@
         </w:tc>
       </w:tr>
     </w:tbl>
-    <w:bookmarkEnd w:id="48"/>
-    <w:bookmarkStart w:id="49" w:name="open-points"/>
+    <w:bookmarkEnd w:id="54"/>
+    <w:bookmarkStart w:id="55" w:name="open-points"/>
     <w:p>
       <w:pPr>
         <w:pStyle w:val="Heading1"/>
@@ -4477,7 +5540,7 @@
       <w:pPr>
         <w:numPr>
           <w:ilvl w:val="0"/>
-          <w:numId w:val="1002"/>
+          <w:numId w:val="1003"/>
         </w:numPr>
         <w:pStyle w:val="Compact"/>
       </w:pPr>
@@ -4519,7 +5582,7 @@
       <w:pPr>
         <w:numPr>
           <w:ilvl w:val="0"/>
-          <w:numId w:val="1002"/>
+          <w:numId w:val="1003"/>
         </w:numPr>
         <w:pStyle w:val="Compact"/>
       </w:pPr>
@@ -4527,7 +5590,7 @@
         <w:t xml:space="preserve">Push provider for iOS without a paid Apple developer account — decide in Phase 6.</w:t>
       </w:r>
     </w:p>
-    <w:bookmarkEnd w:id="49"/>
+    <w:bookmarkEnd w:id="55"/>
     <w:sectPr>
       <w:footnotePr>
         <w:numRestart w:val="eachSect"/>
@@ -4833,6 +5896,9 @@
     </w:lvlOverride>
   </w:num>
   <w:num w:numId="1002">
+    <w:abstractNumId w:val="991"/>
+  </w:num>
+  <w:num w:numId="1003">
     <w:abstractNumId w:val="991"/>
   </w:num>
 </w:numbering>

</xml_diff>